<commit_message>
📄 Feat: Add AI degree and date periods to CV DOCX files
</commit_message>
<xml_diff>
--- a/docs/cv/cv-en.docx
+++ b/docs/cv/cv-en.docx
@@ -491,6 +491,34 @@
     </w:p>
     <w:p>
       <w:pPr>
+        <w:spacing w:before="75" w:after="15"/>
+      </w:pPr>
+      <w:r>
+        <w:rPr>
+          <w:rFonts w:ascii="Segoe UI" w:hAnsi="Segoe UI"/>
+          <w:b/>
+          <w:color w:val="1A1A1A"/>
+          <w:sz w:val="17"/>
+        </w:rPr>
+        <w:t>Bachelor's Degree in Artificial Intelligence Engineering — UNED (National Distance Learning University), Spain</w:t>
+      </w:r>
+    </w:p>
+    <w:p>
+      <w:pPr>
+        <w:spacing w:after="35"/>
+      </w:pPr>
+      <w:r>
+        <w:rPr>
+          <w:rFonts w:ascii="Segoe UI" w:hAnsi="Segoe UI"/>
+          <w:i/>
+          <w:color w:val="555555"/>
+          <w:sz w:val="15"/>
+        </w:rPr>
+        <w:t>Oct 2026 – PRESENT</w:t>
+      </w:r>
+    </w:p>
+    <w:p>
+      <w:pPr>
         <w:spacing w:after="15" w:before="75"/>
       </w:pPr>
       <w:r>
@@ -518,7 +546,7 @@
           <w:sz w:val="15"/>
           <w:szCs w:val="15"/>
         </w:rPr>
-        <w:t xml:space="preserve">2024</w:t>
+        <w:t>Sep 2022 – Jun 2024</w:t>
       </w:r>
     </w:p>
     <w:p>
@@ -550,7 +578,7 @@
           <w:sz w:val="15"/>
           <w:szCs w:val="15"/>
         </w:rPr>
-        <w:t xml:space="preserve">2021</w:t>
+        <w:t>Sep 2019 – Jun 2021</w:t>
       </w:r>
     </w:p>
     <w:p>
@@ -582,7 +610,7 @@
           <w:sz w:val="15"/>
           <w:szCs w:val="15"/>
         </w:rPr>
-        <w:t xml:space="preserve">2019</w:t>
+        <w:t>Sep 2015 – Jun 2019</w:t>
       </w:r>
     </w:p>
     <w:p>

</xml_diff>

<commit_message>
🎯 Update: Education date 2021 & comment sidebar availability
</commit_message>
<xml_diff>
--- a/docs/cv/cv-en.docx
+++ b/docs/cv/cv-en.docx
@@ -74,17 +74,7 @@
           <w:szCs w:val="16"/>
           <w:u w:val="none" w:color="444444"/>
         </w:rPr>
-        <w:t xml:space="preserve"> </w:t>
-      </w:r>
-      <w:r>
-        <w:rPr>
-          <w:rFonts w:eastAsia="Segoe UI" w:cs="Segoe UI" w:ascii="Segoe UI" w:hAnsi="Segoe UI"/>
-          <w:color w:val="444444"/>
-          <w:sz w:val="16"/>
-          <w:szCs w:val="16"/>
-          <w:u w:val="none" w:color="444444"/>
-        </w:rPr>
-        <w:t>| +34 722 868 998</w:t>
+        <w:t xml:space="preserve"> | +34 722 868 998</w:t>
       </w:r>
     </w:p>
     <w:p>
@@ -345,7 +335,7 @@
         <w:pStyle w:val="ListParagraph"/>
         <w:numPr>
           <w:ilvl w:val="0"/>
-          <w:numId w:val="3"/>
+          <w:numId w:val="4"/>
         </w:numPr>
         <w:spacing w:before="0" w:after="12"/>
         <w:rPr/>
@@ -365,7 +355,7 @@
         <w:pStyle w:val="ListParagraph"/>
         <w:numPr>
           <w:ilvl w:val="0"/>
-          <w:numId w:val="1"/>
+          <w:numId w:val="5"/>
         </w:numPr>
         <w:spacing w:before="0" w:after="12"/>
         <w:rPr/>
@@ -421,7 +411,7 @@
         <w:pStyle w:val="ListParagraph"/>
         <w:numPr>
           <w:ilvl w:val="0"/>
-          <w:numId w:val="1"/>
+          <w:numId w:val="6"/>
         </w:numPr>
         <w:spacing w:before="0" w:after="12"/>
         <w:rPr/>
@@ -441,7 +431,7 @@
         <w:pStyle w:val="ListParagraph"/>
         <w:numPr>
           <w:ilvl w:val="0"/>
-          <w:numId w:val="1"/>
+          <w:numId w:val="7"/>
         </w:numPr>
         <w:spacing w:before="0" w:after="12"/>
         <w:rPr/>
@@ -497,7 +487,7 @@
         <w:pStyle w:val="ListParagraph"/>
         <w:numPr>
           <w:ilvl w:val="0"/>
-          <w:numId w:val="1"/>
+          <w:numId w:val="8"/>
         </w:numPr>
         <w:spacing w:before="0" w:after="12"/>
         <w:rPr/>
@@ -517,7 +507,7 @@
         <w:pStyle w:val="ListParagraph"/>
         <w:numPr>
           <w:ilvl w:val="0"/>
-          <w:numId w:val="1"/>
+          <w:numId w:val="9"/>
         </w:numPr>
         <w:spacing w:before="0" w:after="12"/>
         <w:rPr/>
@@ -619,33 +609,8 @@
           <w:sz w:val="15"/>
           <w:szCs w:val="15"/>
         </w:rPr>
-        <w:t>Sep 2022 – Jun 2024</w:t>
-      </w:r>
-    </w:p>
-    <w:p>
-      <w:pPr>
-        <w:pStyle w:val="Normal"/>
-        <w:spacing w:before="75" w:after="15"/>
-        <w:rPr/>
-      </w:pPr>
-      <w:r>
-        <w:rPr>
-          <w:rFonts w:eastAsia="Segoe UI" w:cs="Segoe UI" w:ascii="Segoe UI" w:hAnsi="Segoe UI"/>
-          <w:b/>
-          <w:bCs/>
-          <w:color w:val="1A1A1A"/>
-          <w:sz w:val="17"/>
-          <w:szCs w:val="17"/>
-        </w:rPr>
-        <w:t>Vocational Training Certificate in Microcomputer Systems and Networks (SMR) — IES Poeta Paco Mollá, Petrer</w:t>
-      </w:r>
-    </w:p>
-    <w:p>
-      <w:pPr>
-        <w:pStyle w:val="Normal"/>
-        <w:spacing w:before="0" w:after="35"/>
-        <w:rPr/>
-      </w:pPr>
+        <w:t>Sep 202</w:t>
+      </w:r>
       <w:r>
         <w:rPr>
           <w:rFonts w:eastAsia="Segoe UI" w:cs="Segoe UI" w:ascii="Segoe UI" w:hAnsi="Segoe UI"/>
@@ -655,33 +620,8 @@
           <w:sz w:val="15"/>
           <w:szCs w:val="15"/>
         </w:rPr>
-        <w:t>Sep 2019 – Jun 2021</w:t>
-      </w:r>
-    </w:p>
-    <w:p>
-      <w:pPr>
-        <w:pStyle w:val="Normal"/>
-        <w:spacing w:before="75" w:after="15"/>
-        <w:rPr/>
-      </w:pPr>
-      <w:r>
-        <w:rPr>
-          <w:rFonts w:eastAsia="Segoe UI" w:cs="Segoe UI" w:ascii="Segoe UI" w:hAnsi="Segoe UI"/>
-          <w:b/>
-          <w:bCs/>
-          <w:color w:val="1A1A1A"/>
-          <w:sz w:val="17"/>
-          <w:szCs w:val="17"/>
-        </w:rPr>
-        <w:t>(ESO) Compulsory Secondary Education — IES Azorín, Petrer</w:t>
-      </w:r>
-    </w:p>
-    <w:p>
-      <w:pPr>
-        <w:pStyle w:val="Normal"/>
-        <w:spacing w:before="0" w:after="35"/>
-        <w:rPr/>
-      </w:pPr>
+        <w:t>1</w:t>
+      </w:r>
       <w:r>
         <w:rPr>
           <w:rFonts w:eastAsia="Segoe UI" w:cs="Segoe UI" w:ascii="Segoe UI" w:hAnsi="Segoe UI"/>
@@ -691,6 +631,78 @@
           <w:sz w:val="15"/>
           <w:szCs w:val="15"/>
         </w:rPr>
+        <w:t>– Jun 2024</w:t>
+      </w:r>
+    </w:p>
+    <w:p>
+      <w:pPr>
+        <w:pStyle w:val="Normal"/>
+        <w:spacing w:before="75" w:after="15"/>
+        <w:rPr/>
+      </w:pPr>
+      <w:r>
+        <w:rPr>
+          <w:rFonts w:eastAsia="Segoe UI" w:cs="Segoe UI" w:ascii="Segoe UI" w:hAnsi="Segoe UI"/>
+          <w:b/>
+          <w:bCs/>
+          <w:color w:val="1A1A1A"/>
+          <w:sz w:val="17"/>
+          <w:szCs w:val="17"/>
+        </w:rPr>
+        <w:t>Vocational Training Certificate in Microcomputer Systems and Networks (SMR) — IES Poeta Paco Mollá, Petrer</w:t>
+      </w:r>
+    </w:p>
+    <w:p>
+      <w:pPr>
+        <w:pStyle w:val="Normal"/>
+        <w:spacing w:before="0" w:after="35"/>
+        <w:rPr/>
+      </w:pPr>
+      <w:r>
+        <w:rPr>
+          <w:rFonts w:eastAsia="Segoe UI" w:cs="Segoe UI" w:ascii="Segoe UI" w:hAnsi="Segoe UI"/>
+          <w:i/>
+          <w:iCs/>
+          <w:color w:val="555555"/>
+          <w:sz w:val="15"/>
+          <w:szCs w:val="15"/>
+        </w:rPr>
+        <w:t>Sep 2019 – Jun 2021</w:t>
+      </w:r>
+    </w:p>
+    <w:p>
+      <w:pPr>
+        <w:pStyle w:val="Normal"/>
+        <w:spacing w:before="75" w:after="15"/>
+        <w:rPr/>
+      </w:pPr>
+      <w:r>
+        <w:rPr>
+          <w:rFonts w:eastAsia="Segoe UI" w:cs="Segoe UI" w:ascii="Segoe UI" w:hAnsi="Segoe UI"/>
+          <w:b/>
+          <w:bCs/>
+          <w:color w:val="1A1A1A"/>
+          <w:sz w:val="17"/>
+          <w:szCs w:val="17"/>
+        </w:rPr>
+        <w:t>(ESO) Compulsory Secondary Education — IES Azorín, Petrer</w:t>
+      </w:r>
+    </w:p>
+    <w:p>
+      <w:pPr>
+        <w:pStyle w:val="Normal"/>
+        <w:spacing w:before="0" w:after="35"/>
+        <w:rPr/>
+      </w:pPr>
+      <w:r>
+        <w:rPr>
+          <w:rFonts w:eastAsia="Segoe UI" w:cs="Segoe UI" w:ascii="Segoe UI" w:hAnsi="Segoe UI"/>
+          <w:i/>
+          <w:iCs/>
+          <w:color w:val="555555"/>
+          <w:sz w:val="15"/>
+          <w:szCs w:val="15"/>
+        </w:rPr>
         <w:t>Sep 2015 – Jun 2019</w:t>
       </w:r>
     </w:p>
@@ -721,7 +733,7 @@
         <w:pStyle w:val="ListParagraph"/>
         <w:numPr>
           <w:ilvl w:val="0"/>
-          <w:numId w:val="1"/>
+          <w:numId w:val="10"/>
         </w:numPr>
         <w:spacing w:before="0" w:after="12"/>
         <w:rPr/>
@@ -741,7 +753,7 @@
         <w:pStyle w:val="ListParagraph"/>
         <w:numPr>
           <w:ilvl w:val="0"/>
-          <w:numId w:val="1"/>
+          <w:numId w:val="11"/>
         </w:numPr>
         <w:spacing w:before="0" w:after="12"/>
         <w:rPr/>
@@ -761,7 +773,7 @@
         <w:pStyle w:val="ListParagraph"/>
         <w:numPr>
           <w:ilvl w:val="0"/>
-          <w:numId w:val="1"/>
+          <w:numId w:val="12"/>
         </w:numPr>
         <w:spacing w:before="0" w:after="12"/>
         <w:rPr/>
@@ -781,7 +793,7 @@
         <w:pStyle w:val="ListParagraph"/>
         <w:numPr>
           <w:ilvl w:val="0"/>
-          <w:numId w:val="1"/>
+          <w:numId w:val="13"/>
         </w:numPr>
         <w:spacing w:before="0" w:after="12"/>
         <w:rPr/>
@@ -801,7 +813,7 @@
         <w:pStyle w:val="ListParagraph"/>
         <w:numPr>
           <w:ilvl w:val="0"/>
-          <w:numId w:val="1"/>
+          <w:numId w:val="14"/>
         </w:numPr>
         <w:spacing w:before="0" w:after="12"/>
         <w:rPr/>
@@ -821,7 +833,7 @@
         <w:pStyle w:val="ListParagraph"/>
         <w:numPr>
           <w:ilvl w:val="0"/>
-          <w:numId w:val="1"/>
+          <w:numId w:val="15"/>
         </w:numPr>
         <w:spacing w:before="0" w:after="12"/>
         <w:rPr/>
@@ -841,7 +853,7 @@
         <w:pStyle w:val="ListParagraph"/>
         <w:numPr>
           <w:ilvl w:val="0"/>
-          <w:numId w:val="1"/>
+          <w:numId w:val="16"/>
         </w:numPr>
         <w:spacing w:before="0" w:after="12"/>
         <w:rPr/>
@@ -861,7 +873,7 @@
         <w:pStyle w:val="ListParagraph"/>
         <w:numPr>
           <w:ilvl w:val="0"/>
-          <w:numId w:val="1"/>
+          <w:numId w:val="17"/>
         </w:numPr>
         <w:spacing w:before="0" w:after="12"/>
         <w:rPr/>
@@ -881,7 +893,7 @@
         <w:pStyle w:val="ListParagraph"/>
         <w:numPr>
           <w:ilvl w:val="0"/>
-          <w:numId w:val="1"/>
+          <w:numId w:val="18"/>
         </w:numPr>
         <w:spacing w:before="0" w:after="12"/>
         <w:rPr/>
@@ -901,7 +913,7 @@
         <w:pStyle w:val="ListParagraph"/>
         <w:numPr>
           <w:ilvl w:val="0"/>
-          <w:numId w:val="1"/>
+          <w:numId w:val="19"/>
         </w:numPr>
         <w:spacing w:before="0" w:after="12"/>
         <w:rPr/>
@@ -921,7 +933,7 @@
         <w:pStyle w:val="ListParagraph"/>
         <w:numPr>
           <w:ilvl w:val="0"/>
-          <w:numId w:val="1"/>
+          <w:numId w:val="20"/>
         </w:numPr>
         <w:spacing w:before="0" w:after="12"/>
         <w:rPr/>
@@ -1066,6 +1078,7 @@
         </w:tabs>
         <w:ind w:left="1080" w:hanging="360"/>
       </w:pPr>
+      <w:rPr/>
     </w:lvl>
     <w:lvl w:ilvl="2">
       <w:start w:val="1"/>
@@ -1078,6 +1091,7 @@
         </w:tabs>
         <w:ind w:left="1440" w:hanging="360"/>
       </w:pPr>
+      <w:rPr/>
     </w:lvl>
     <w:lvl w:ilvl="3">
       <w:start w:val="1"/>
@@ -1090,6 +1104,7 @@
         </w:tabs>
         <w:ind w:left="1800" w:hanging="360"/>
       </w:pPr>
+      <w:rPr/>
     </w:lvl>
     <w:lvl w:ilvl="4">
       <w:start w:val="1"/>
@@ -1102,6 +1117,7 @@
         </w:tabs>
         <w:ind w:left="2160" w:hanging="360"/>
       </w:pPr>
+      <w:rPr/>
     </w:lvl>
     <w:lvl w:ilvl="5">
       <w:start w:val="1"/>
@@ -1114,6 +1130,7 @@
         </w:tabs>
         <w:ind w:left="2520" w:hanging="360"/>
       </w:pPr>
+      <w:rPr/>
     </w:lvl>
     <w:lvl w:ilvl="6">
       <w:start w:val="1"/>
@@ -1126,6 +1143,7 @@
         </w:tabs>
         <w:ind w:left="2880" w:hanging="360"/>
       </w:pPr>
+      <w:rPr/>
     </w:lvl>
     <w:lvl w:ilvl="7">
       <w:start w:val="1"/>
@@ -1138,6 +1156,7 @@
         </w:tabs>
         <w:ind w:left="3240" w:hanging="360"/>
       </w:pPr>
+      <w:rPr/>
     </w:lvl>
     <w:lvl w:ilvl="8">
       <w:start w:val="1"/>
@@ -1150,9 +1169,131 @@
         </w:tabs>
         <w:ind w:left="3600" w:hanging="360"/>
       </w:pPr>
+      <w:rPr/>
     </w:lvl>
   </w:abstractNum>
   <w:abstractNum w:abstractNumId="2">
+    <w:lvl w:ilvl="0">
+      <w:start w:val="1"/>
+      <w:numFmt w:val="bullet"/>
+      <w:lvlText w:val=""/>
+      <w:lvlJc w:val="left"/>
+      <w:pPr>
+        <w:tabs>
+          <w:tab w:val="num" w:pos="0"/>
+        </w:tabs>
+        <w:ind w:left="403" w:hanging="201"/>
+      </w:pPr>
+      <w:rPr>
+        <w:rFonts w:ascii="Symbol" w:hAnsi="Symbol" w:cs="Symbol" w:hint="default"/>
+      </w:rPr>
+    </w:lvl>
+    <w:lvl w:ilvl="1">
+      <w:start w:val="1"/>
+      <w:numFmt w:val="decimal"/>
+      <w:lvlText w:val="%2."/>
+      <w:lvlJc w:val="left"/>
+      <w:pPr>
+        <w:tabs>
+          <w:tab w:val="num" w:pos="1080"/>
+        </w:tabs>
+        <w:ind w:left="1080" w:hanging="360"/>
+      </w:pPr>
+      <w:rPr/>
+    </w:lvl>
+    <w:lvl w:ilvl="2">
+      <w:start w:val="1"/>
+      <w:numFmt w:val="decimal"/>
+      <w:lvlText w:val="%3."/>
+      <w:lvlJc w:val="left"/>
+      <w:pPr>
+        <w:tabs>
+          <w:tab w:val="num" w:pos="1440"/>
+        </w:tabs>
+        <w:ind w:left="1440" w:hanging="360"/>
+      </w:pPr>
+      <w:rPr/>
+    </w:lvl>
+    <w:lvl w:ilvl="3">
+      <w:start w:val="1"/>
+      <w:numFmt w:val="decimal"/>
+      <w:lvlText w:val="%4."/>
+      <w:lvlJc w:val="left"/>
+      <w:pPr>
+        <w:tabs>
+          <w:tab w:val="num" w:pos="1800"/>
+        </w:tabs>
+        <w:ind w:left="1800" w:hanging="360"/>
+      </w:pPr>
+      <w:rPr/>
+    </w:lvl>
+    <w:lvl w:ilvl="4">
+      <w:start w:val="1"/>
+      <w:numFmt w:val="decimal"/>
+      <w:lvlText w:val="%5."/>
+      <w:lvlJc w:val="left"/>
+      <w:pPr>
+        <w:tabs>
+          <w:tab w:val="num" w:pos="2160"/>
+        </w:tabs>
+        <w:ind w:left="2160" w:hanging="360"/>
+      </w:pPr>
+      <w:rPr/>
+    </w:lvl>
+    <w:lvl w:ilvl="5">
+      <w:start w:val="1"/>
+      <w:numFmt w:val="decimal"/>
+      <w:lvlText w:val="%6."/>
+      <w:lvlJc w:val="left"/>
+      <w:pPr>
+        <w:tabs>
+          <w:tab w:val="num" w:pos="2520"/>
+        </w:tabs>
+        <w:ind w:left="2520" w:hanging="360"/>
+      </w:pPr>
+      <w:rPr/>
+    </w:lvl>
+    <w:lvl w:ilvl="6">
+      <w:start w:val="1"/>
+      <w:numFmt w:val="decimal"/>
+      <w:lvlText w:val="%7."/>
+      <w:lvlJc w:val="left"/>
+      <w:pPr>
+        <w:tabs>
+          <w:tab w:val="num" w:pos="2880"/>
+        </w:tabs>
+        <w:ind w:left="2880" w:hanging="360"/>
+      </w:pPr>
+      <w:rPr/>
+    </w:lvl>
+    <w:lvl w:ilvl="7">
+      <w:start w:val="1"/>
+      <w:numFmt w:val="decimal"/>
+      <w:lvlText w:val="%8."/>
+      <w:lvlJc w:val="left"/>
+      <w:pPr>
+        <w:tabs>
+          <w:tab w:val="num" w:pos="3240"/>
+        </w:tabs>
+        <w:ind w:left="3240" w:hanging="360"/>
+      </w:pPr>
+      <w:rPr/>
+    </w:lvl>
+    <w:lvl w:ilvl="8">
+      <w:start w:val="1"/>
+      <w:numFmt w:val="decimal"/>
+      <w:lvlText w:val="%9."/>
+      <w:lvlJc w:val="left"/>
+      <w:pPr>
+        <w:tabs>
+          <w:tab w:val="num" w:pos="3600"/>
+        </w:tabs>
+        <w:ind w:left="3600" w:hanging="360"/>
+      </w:pPr>
+      <w:rPr/>
+    </w:lvl>
+  </w:abstractNum>
+  <w:abstractNum w:abstractNumId="3">
     <w:lvl w:ilvl="0">
       <w:start w:val="1"/>
       <w:numFmt w:val="none"/>
@@ -1278,10 +1419,61 @@
     <w:abstractNumId w:val="2"/>
   </w:num>
   <w:num w:numId="3">
-    <w:abstractNumId w:val="1"/>
+    <w:abstractNumId w:val="3"/>
+  </w:num>
+  <w:num w:numId="4">
+    <w:abstractNumId w:val="2"/>
     <w:lvlOverride w:ilvl="0">
       <w:startOverride w:val="1"/>
     </w:lvlOverride>
+  </w:num>
+  <w:num w:numId="5">
+    <w:abstractNumId w:val="2"/>
+  </w:num>
+  <w:num w:numId="6">
+    <w:abstractNumId w:val="2"/>
+  </w:num>
+  <w:num w:numId="7">
+    <w:abstractNumId w:val="2"/>
+  </w:num>
+  <w:num w:numId="8">
+    <w:abstractNumId w:val="2"/>
+  </w:num>
+  <w:num w:numId="9">
+    <w:abstractNumId w:val="2"/>
+  </w:num>
+  <w:num w:numId="10">
+    <w:abstractNumId w:val="2"/>
+  </w:num>
+  <w:num w:numId="11">
+    <w:abstractNumId w:val="2"/>
+  </w:num>
+  <w:num w:numId="12">
+    <w:abstractNumId w:val="2"/>
+  </w:num>
+  <w:num w:numId="13">
+    <w:abstractNumId w:val="2"/>
+  </w:num>
+  <w:num w:numId="14">
+    <w:abstractNumId w:val="2"/>
+  </w:num>
+  <w:num w:numId="15">
+    <w:abstractNumId w:val="2"/>
+  </w:num>
+  <w:num w:numId="16">
+    <w:abstractNumId w:val="2"/>
+  </w:num>
+  <w:num w:numId="17">
+    <w:abstractNumId w:val="2"/>
+  </w:num>
+  <w:num w:numId="18">
+    <w:abstractNumId w:val="2"/>
+  </w:num>
+  <w:num w:numId="19">
+    <w:abstractNumId w:val="2"/>
+  </w:num>
+  <w:num w:numId="20">
+    <w:abstractNumId w:val="2"/>
   </w:num>
 </w:numbering>
 </file>
@@ -1306,6 +1498,7 @@
     <w:qFormat/>
     <w:pPr>
       <w:widowControl/>
+      <w:suppressAutoHyphens w:val="true"/>
       <w:bidi w:val="0"/>
       <w:spacing w:before="0" w:after="0"/>
       <w:jc w:val="left"/>
@@ -1321,7 +1514,7 @@
   </w:style>
   <w:style w:type="paragraph" w:styleId="Heading1">
     <w:name w:val="heading 1"/>
-    <w:basedOn w:val="Ttulo"/>
+    <w:basedOn w:val="Ttulouser"/>
     <w:qFormat/>
     <w:pPr/>
     <w:rPr>
@@ -1332,7 +1525,7 @@
   </w:style>
   <w:style w:type="paragraph" w:styleId="Heading2">
     <w:name w:val="heading 2"/>
-    <w:basedOn w:val="Ttulo"/>
+    <w:basedOn w:val="Ttulouser"/>
     <w:qFormat/>
     <w:pPr/>
     <w:rPr>
@@ -1343,7 +1536,7 @@
   </w:style>
   <w:style w:type="paragraph" w:styleId="Heading3">
     <w:name w:val="heading 3"/>
-    <w:basedOn w:val="Ttulo"/>
+    <w:basedOn w:val="Ttulouser"/>
     <w:qFormat/>
     <w:pPr/>
     <w:rPr>
@@ -1354,7 +1547,7 @@
   </w:style>
   <w:style w:type="paragraph" w:styleId="Heading4">
     <w:name w:val="heading 4"/>
-    <w:basedOn w:val="Ttulo"/>
+    <w:basedOn w:val="Ttulouser"/>
     <w:qFormat/>
     <w:pPr/>
     <w:rPr>
@@ -1365,7 +1558,7 @@
   </w:style>
   <w:style w:type="paragraph" w:styleId="Heading5">
     <w:name w:val="heading 5"/>
-    <w:basedOn w:val="Ttulo"/>
+    <w:basedOn w:val="Ttulouser"/>
     <w:qFormat/>
     <w:pPr/>
     <w:rPr>
@@ -1374,7 +1567,7 @@
   </w:style>
   <w:style w:type="paragraph" w:styleId="Heading6">
     <w:name w:val="heading 6"/>
-    <w:basedOn w:val="Ttulo"/>
+    <w:basedOn w:val="Ttulouser"/>
     <w:qFormat/>
     <w:pPr/>
     <w:rPr>
@@ -1390,11 +1583,18 @@
       <w:u w:val="single"/>
     </w:rPr>
   </w:style>
-  <w:style w:type="character" w:styleId="Caracteresdenotaalpie">
-    <w:name w:val="Caracteres de nota al pie"/>
+  <w:style w:type="character" w:styleId="Caracteresdenotaalpieuser">
+    <w:name w:val="Caracteres de nota al pie (user)"/>
     <w:uiPriority w:val="99"/>
     <w:semiHidden/>
     <w:unhideWhenUsed/>
+    <w:qFormat/>
+    <w:rPr>
+      <w:vertAlign w:val="superscript"/>
+    </w:rPr>
+  </w:style>
+  <w:style w:type="character" w:styleId="Caracteresdenotaalpie">
+    <w:name w:val="Caracteres de nota al pie"/>
     <w:qFormat/>
     <w:rPr>
       <w:vertAlign w:val="superscript"/>
@@ -1417,11 +1617,18 @@
       <w:szCs w:val="20"/>
     </w:rPr>
   </w:style>
-  <w:style w:type="character" w:styleId="Caracteresdenotafinal">
-    <w:name w:val="Caracteres de nota final"/>
+  <w:style w:type="character" w:styleId="Caracteresdenotafinaluser">
+    <w:name w:val="Caracteres de nota final (user)"/>
     <w:uiPriority w:val="99"/>
     <w:semiHidden/>
     <w:unhideWhenUsed/>
+    <w:qFormat/>
+    <w:rPr>
+      <w:vertAlign w:val="superscript"/>
+    </w:rPr>
+  </w:style>
+  <w:style w:type="character" w:styleId="Caracteresdenotafinal">
+    <w:name w:val="Caracteres de nota final"/>
     <w:qFormat/>
     <w:rPr>
       <w:vertAlign w:val="superscript"/>
@@ -1502,9 +1709,35 @@
       <w:rFonts w:cs="Lucida Sans"/>
     </w:rPr>
   </w:style>
+  <w:style w:type="paragraph" w:styleId="Ttulouser">
+    <w:name w:val="Título (user)"/>
+    <w:basedOn w:val="Normal"/>
+    <w:next w:val="BodyText"/>
+    <w:qFormat/>
+    <w:pPr>
+      <w:keepNext w:val="true"/>
+      <w:spacing w:before="240" w:after="120"/>
+    </w:pPr>
+    <w:rPr>
+      <w:rFonts w:ascii="Liberation Sans" w:hAnsi="Liberation Sans" w:eastAsia="Microsoft YaHei" w:cs="Lucida Sans"/>
+      <w:sz w:val="28"/>
+      <w:szCs w:val="28"/>
+    </w:rPr>
+  </w:style>
+  <w:style w:type="paragraph" w:styleId="ndiceuser">
+    <w:name w:val="Índice (user)"/>
+    <w:basedOn w:val="Normal"/>
+    <w:qFormat/>
+    <w:pPr>
+      <w:suppressLineNumbers/>
+    </w:pPr>
+    <w:rPr>
+      <w:rFonts w:cs="Lucida Sans"/>
+    </w:rPr>
+  </w:style>
   <w:style w:type="paragraph" w:styleId="Title">
     <w:name w:val="Title"/>
-    <w:basedOn w:val="Ttulo"/>
+    <w:basedOn w:val="Ttulouser"/>
     <w:qFormat/>
     <w:pPr/>
     <w:rPr>
@@ -1517,6 +1750,7 @@
     <w:qFormat/>
     <w:pPr>
       <w:widowControl/>
+      <w:suppressAutoHyphens w:val="true"/>
       <w:bidi w:val="0"/>
       <w:spacing w:before="0" w:after="0"/>
       <w:jc w:val="left"/>
@@ -1537,6 +1771,7 @@
     <w:qFormat/>
     <w:pPr>
       <w:widowControl/>
+      <w:suppressAutoHyphens w:val="true"/>
       <w:bidi w:val="0"/>
       <w:spacing w:before="0" w:after="0"/>
       <w:jc w:val="left"/>

</xml_diff>

<commit_message>
🔧 Fix: Add PostgreSQL back to databases, include MongoDB
</commit_message>
<xml_diff>
--- a/docs/cv/cv-en.docx
+++ b/docs/cv/cv-en.docx
@@ -242,7 +242,16 @@
           <w:sz w:val="17"/>
           <w:szCs w:val="17"/>
         </w:rPr>
-        <w:t>Oracle, SQLite, PostgreSQL</w:t>
+        <w:t xml:space="preserve">Oracle, SQLite, PostgreSQL, </w:t>
+      </w:r>
+      <w:r>
+        <w:rPr>
+          <w:rFonts w:eastAsia="Segoe UI" w:cs="Segoe UI" w:ascii="Segoe UI" w:hAnsi="Segoe UI"/>
+          <w:color w:val="2B2B2B"/>
+          <w:sz w:val="17"/>
+          <w:szCs w:val="17"/>
+        </w:rPr>
+        <w:t>MongoDB</w:t>
       </w:r>
     </w:p>
     <w:p>
@@ -261,6 +270,17 @@
           <w:szCs w:val="17"/>
         </w:rPr>
         <w:t xml:space="preserve">Tools &amp; Practices: </w:t>
+      </w:r>
+      <w:r>
+        <w:rPr>
+          <w:rFonts w:eastAsia="Segoe UI" w:cs="Segoe UI" w:ascii="Segoe UI" w:hAnsi="Segoe UI"/>
+          <w:b w:val="false"/>
+          <w:bCs w:val="false"/>
+          <w:color w:val="2B2B2B"/>
+          <w:sz w:val="17"/>
+          <w:szCs w:val="17"/>
+        </w:rPr>
+        <w:t xml:space="preserve">Docker, AWS, </w:t>
       </w:r>
       <w:r>
         <w:rPr>
@@ -309,7 +329,29 @@
           <w:sz w:val="17"/>
           <w:szCs w:val="17"/>
         </w:rPr>
-        <w:t>Full Stack Developer — NTT DATA, San Juan Beach Alicante</w:t>
+        <w:t xml:space="preserve">Full Stack Developer — NTT DATA, </w:t>
+      </w:r>
+      <w:r>
+        <w:rPr>
+          <w:rFonts w:eastAsia="Segoe UI" w:cs="Segoe UI" w:ascii="Segoe UI" w:hAnsi="Segoe UI"/>
+          <w:b/>
+          <w:bCs/>
+          <w:color w:val="1A1A1A"/>
+          <w:sz w:val="17"/>
+          <w:szCs w:val="17"/>
+        </w:rPr>
+        <w:t>Playa San Juan</w:t>
+      </w:r>
+      <w:r>
+        <w:rPr>
+          <w:rFonts w:eastAsia="Segoe UI" w:cs="Segoe UI" w:ascii="Segoe UI" w:hAnsi="Segoe UI"/>
+          <w:b/>
+          <w:bCs/>
+          <w:color w:val="1A1A1A"/>
+          <w:sz w:val="17"/>
+          <w:szCs w:val="17"/>
+        </w:rPr>
+        <w:t xml:space="preserve"> Alicante</w:t>
       </w:r>
     </w:p>
     <w:p>
@@ -335,7 +377,7 @@
         <w:pStyle w:val="ListParagraph"/>
         <w:numPr>
           <w:ilvl w:val="0"/>
-          <w:numId w:val="4"/>
+          <w:numId w:val="19"/>
         </w:numPr>
         <w:spacing w:before="0" w:after="12"/>
         <w:rPr/>
@@ -355,7 +397,7 @@
         <w:pStyle w:val="ListParagraph"/>
         <w:numPr>
           <w:ilvl w:val="0"/>
-          <w:numId w:val="5"/>
+          <w:numId w:val="20"/>
         </w:numPr>
         <w:spacing w:before="0" w:after="12"/>
         <w:rPr/>
@@ -411,7 +453,7 @@
         <w:pStyle w:val="ListParagraph"/>
         <w:numPr>
           <w:ilvl w:val="0"/>
-          <w:numId w:val="6"/>
+          <w:numId w:val="21"/>
         </w:numPr>
         <w:spacing w:before="0" w:after="12"/>
         <w:rPr/>
@@ -431,7 +473,7 @@
         <w:pStyle w:val="ListParagraph"/>
         <w:numPr>
           <w:ilvl w:val="0"/>
-          <w:numId w:val="7"/>
+          <w:numId w:val="22"/>
         </w:numPr>
         <w:spacing w:before="0" w:after="12"/>
         <w:rPr/>
@@ -487,7 +529,7 @@
         <w:pStyle w:val="ListParagraph"/>
         <w:numPr>
           <w:ilvl w:val="0"/>
-          <w:numId w:val="8"/>
+          <w:numId w:val="23"/>
         </w:numPr>
         <w:spacing w:before="0" w:after="12"/>
         <w:rPr/>
@@ -507,7 +549,7 @@
         <w:pStyle w:val="ListParagraph"/>
         <w:numPr>
           <w:ilvl w:val="0"/>
-          <w:numId w:val="9"/>
+          <w:numId w:val="24"/>
         </w:numPr>
         <w:spacing w:before="0" w:after="12"/>
         <w:rPr/>
@@ -609,29 +651,7 @@
           <w:sz w:val="15"/>
           <w:szCs w:val="15"/>
         </w:rPr>
-        <w:t>Sep 202</w:t>
-      </w:r>
-      <w:r>
-        <w:rPr>
-          <w:rFonts w:eastAsia="Segoe UI" w:cs="Segoe UI" w:ascii="Segoe UI" w:hAnsi="Segoe UI"/>
-          <w:i/>
-          <w:iCs/>
-          <w:color w:val="555555"/>
-          <w:sz w:val="15"/>
-          <w:szCs w:val="15"/>
-        </w:rPr>
-        <w:t>1</w:t>
-      </w:r>
-      <w:r>
-        <w:rPr>
-          <w:rFonts w:eastAsia="Segoe UI" w:cs="Segoe UI" w:ascii="Segoe UI" w:hAnsi="Segoe UI"/>
-          <w:i/>
-          <w:iCs/>
-          <w:color w:val="555555"/>
-          <w:sz w:val="15"/>
-          <w:szCs w:val="15"/>
-        </w:rPr>
-        <w:t>– Jun 2024</w:t>
+        <w:t>Sep 2021– Jun 2024</w:t>
       </w:r>
     </w:p>
     <w:p>
@@ -733,7 +753,7 @@
         <w:pStyle w:val="ListParagraph"/>
         <w:numPr>
           <w:ilvl w:val="0"/>
-          <w:numId w:val="10"/>
+          <w:numId w:val="25"/>
         </w:numPr>
         <w:spacing w:before="0" w:after="12"/>
         <w:rPr/>
@@ -753,7 +773,7 @@
         <w:pStyle w:val="ListParagraph"/>
         <w:numPr>
           <w:ilvl w:val="0"/>
-          <w:numId w:val="11"/>
+          <w:numId w:val="26"/>
         </w:numPr>
         <w:spacing w:before="0" w:after="12"/>
         <w:rPr/>
@@ -773,7 +793,7 @@
         <w:pStyle w:val="ListParagraph"/>
         <w:numPr>
           <w:ilvl w:val="0"/>
-          <w:numId w:val="12"/>
+          <w:numId w:val="27"/>
         </w:numPr>
         <w:spacing w:before="0" w:after="12"/>
         <w:rPr/>
@@ -793,7 +813,7 @@
         <w:pStyle w:val="ListParagraph"/>
         <w:numPr>
           <w:ilvl w:val="0"/>
-          <w:numId w:val="13"/>
+          <w:numId w:val="28"/>
         </w:numPr>
         <w:spacing w:before="0" w:after="12"/>
         <w:rPr/>
@@ -813,7 +833,7 @@
         <w:pStyle w:val="ListParagraph"/>
         <w:numPr>
           <w:ilvl w:val="0"/>
-          <w:numId w:val="14"/>
+          <w:numId w:val="29"/>
         </w:numPr>
         <w:spacing w:before="0" w:after="12"/>
         <w:rPr/>
@@ -833,7 +853,7 @@
         <w:pStyle w:val="ListParagraph"/>
         <w:numPr>
           <w:ilvl w:val="0"/>
-          <w:numId w:val="15"/>
+          <w:numId w:val="30"/>
         </w:numPr>
         <w:spacing w:before="0" w:after="12"/>
         <w:rPr/>
@@ -853,7 +873,7 @@
         <w:pStyle w:val="ListParagraph"/>
         <w:numPr>
           <w:ilvl w:val="0"/>
-          <w:numId w:val="16"/>
+          <w:numId w:val="31"/>
         </w:numPr>
         <w:spacing w:before="0" w:after="12"/>
         <w:rPr/>
@@ -873,7 +893,7 @@
         <w:pStyle w:val="ListParagraph"/>
         <w:numPr>
           <w:ilvl w:val="0"/>
-          <w:numId w:val="17"/>
+          <w:numId w:val="32"/>
         </w:numPr>
         <w:spacing w:before="0" w:after="12"/>
         <w:rPr/>
@@ -893,7 +913,7 @@
         <w:pStyle w:val="ListParagraph"/>
         <w:numPr>
           <w:ilvl w:val="0"/>
-          <w:numId w:val="18"/>
+          <w:numId w:val="33"/>
         </w:numPr>
         <w:spacing w:before="0" w:after="12"/>
         <w:rPr/>
@@ -913,7 +933,7 @@
         <w:pStyle w:val="ListParagraph"/>
         <w:numPr>
           <w:ilvl w:val="0"/>
-          <w:numId w:val="19"/>
+          <w:numId w:val="34"/>
         </w:numPr>
         <w:spacing w:before="0" w:after="12"/>
         <w:rPr/>
@@ -933,7 +953,7 @@
         <w:pStyle w:val="ListParagraph"/>
         <w:numPr>
           <w:ilvl w:val="0"/>
-          <w:numId w:val="20"/>
+          <w:numId w:val="35"/>
         </w:numPr>
         <w:spacing w:before="0" w:after="12"/>
         <w:rPr/>
@@ -1296,6 +1316,1821 @@
   <w:abstractNum w:abstractNumId="3">
     <w:lvl w:ilvl="0">
       <w:start w:val="1"/>
+      <w:numFmt w:val="bullet"/>
+      <w:lvlText w:val=""/>
+      <w:lvlJc w:val="left"/>
+      <w:pPr>
+        <w:tabs>
+          <w:tab w:val="num" w:pos="0"/>
+        </w:tabs>
+        <w:ind w:left="403" w:hanging="201"/>
+      </w:pPr>
+      <w:rPr>
+        <w:rFonts w:ascii="Symbol" w:hAnsi="Symbol" w:cs="Symbol" w:hint="default"/>
+      </w:rPr>
+    </w:lvl>
+    <w:lvl w:ilvl="1">
+      <w:start w:val="1"/>
+      <w:numFmt w:val="decimal"/>
+      <w:lvlText w:val="%2."/>
+      <w:lvlJc w:val="left"/>
+      <w:pPr>
+        <w:tabs>
+          <w:tab w:val="num" w:pos="1080"/>
+        </w:tabs>
+        <w:ind w:left="1080" w:hanging="360"/>
+      </w:pPr>
+      <w:rPr/>
+    </w:lvl>
+    <w:lvl w:ilvl="2">
+      <w:start w:val="1"/>
+      <w:numFmt w:val="decimal"/>
+      <w:lvlText w:val="%3."/>
+      <w:lvlJc w:val="left"/>
+      <w:pPr>
+        <w:tabs>
+          <w:tab w:val="num" w:pos="1440"/>
+        </w:tabs>
+        <w:ind w:left="1440" w:hanging="360"/>
+      </w:pPr>
+      <w:rPr/>
+    </w:lvl>
+    <w:lvl w:ilvl="3">
+      <w:start w:val="1"/>
+      <w:numFmt w:val="decimal"/>
+      <w:lvlText w:val="%4."/>
+      <w:lvlJc w:val="left"/>
+      <w:pPr>
+        <w:tabs>
+          <w:tab w:val="num" w:pos="1800"/>
+        </w:tabs>
+        <w:ind w:left="1800" w:hanging="360"/>
+      </w:pPr>
+      <w:rPr/>
+    </w:lvl>
+    <w:lvl w:ilvl="4">
+      <w:start w:val="1"/>
+      <w:numFmt w:val="decimal"/>
+      <w:lvlText w:val="%5."/>
+      <w:lvlJc w:val="left"/>
+      <w:pPr>
+        <w:tabs>
+          <w:tab w:val="num" w:pos="2160"/>
+        </w:tabs>
+        <w:ind w:left="2160" w:hanging="360"/>
+      </w:pPr>
+      <w:rPr/>
+    </w:lvl>
+    <w:lvl w:ilvl="5">
+      <w:start w:val="1"/>
+      <w:numFmt w:val="decimal"/>
+      <w:lvlText w:val="%6."/>
+      <w:lvlJc w:val="left"/>
+      <w:pPr>
+        <w:tabs>
+          <w:tab w:val="num" w:pos="2520"/>
+        </w:tabs>
+        <w:ind w:left="2520" w:hanging="360"/>
+      </w:pPr>
+      <w:rPr/>
+    </w:lvl>
+    <w:lvl w:ilvl="6">
+      <w:start w:val="1"/>
+      <w:numFmt w:val="decimal"/>
+      <w:lvlText w:val="%7."/>
+      <w:lvlJc w:val="left"/>
+      <w:pPr>
+        <w:tabs>
+          <w:tab w:val="num" w:pos="2880"/>
+        </w:tabs>
+        <w:ind w:left="2880" w:hanging="360"/>
+      </w:pPr>
+      <w:rPr/>
+    </w:lvl>
+    <w:lvl w:ilvl="7">
+      <w:start w:val="1"/>
+      <w:numFmt w:val="decimal"/>
+      <w:lvlText w:val="%8."/>
+      <w:lvlJc w:val="left"/>
+      <w:pPr>
+        <w:tabs>
+          <w:tab w:val="num" w:pos="3240"/>
+        </w:tabs>
+        <w:ind w:left="3240" w:hanging="360"/>
+      </w:pPr>
+      <w:rPr/>
+    </w:lvl>
+    <w:lvl w:ilvl="8">
+      <w:start w:val="1"/>
+      <w:numFmt w:val="decimal"/>
+      <w:lvlText w:val="%9."/>
+      <w:lvlJc w:val="left"/>
+      <w:pPr>
+        <w:tabs>
+          <w:tab w:val="num" w:pos="3600"/>
+        </w:tabs>
+        <w:ind w:left="3600" w:hanging="360"/>
+      </w:pPr>
+      <w:rPr/>
+    </w:lvl>
+  </w:abstractNum>
+  <w:abstractNum w:abstractNumId="4">
+    <w:lvl w:ilvl="0">
+      <w:start w:val="1"/>
+      <w:numFmt w:val="bullet"/>
+      <w:lvlText w:val=""/>
+      <w:lvlJc w:val="left"/>
+      <w:pPr>
+        <w:tabs>
+          <w:tab w:val="num" w:pos="0"/>
+        </w:tabs>
+        <w:ind w:left="403" w:hanging="201"/>
+      </w:pPr>
+      <w:rPr>
+        <w:rFonts w:ascii="Symbol" w:hAnsi="Symbol" w:cs="Symbol" w:hint="default"/>
+      </w:rPr>
+    </w:lvl>
+    <w:lvl w:ilvl="1">
+      <w:start w:val="1"/>
+      <w:numFmt w:val="decimal"/>
+      <w:lvlText w:val="%2."/>
+      <w:lvlJc w:val="left"/>
+      <w:pPr>
+        <w:tabs>
+          <w:tab w:val="num" w:pos="1080"/>
+        </w:tabs>
+        <w:ind w:left="1080" w:hanging="360"/>
+      </w:pPr>
+      <w:rPr/>
+    </w:lvl>
+    <w:lvl w:ilvl="2">
+      <w:start w:val="1"/>
+      <w:numFmt w:val="decimal"/>
+      <w:lvlText w:val="%3."/>
+      <w:lvlJc w:val="left"/>
+      <w:pPr>
+        <w:tabs>
+          <w:tab w:val="num" w:pos="1440"/>
+        </w:tabs>
+        <w:ind w:left="1440" w:hanging="360"/>
+      </w:pPr>
+      <w:rPr/>
+    </w:lvl>
+    <w:lvl w:ilvl="3">
+      <w:start w:val="1"/>
+      <w:numFmt w:val="decimal"/>
+      <w:lvlText w:val="%4."/>
+      <w:lvlJc w:val="left"/>
+      <w:pPr>
+        <w:tabs>
+          <w:tab w:val="num" w:pos="1800"/>
+        </w:tabs>
+        <w:ind w:left="1800" w:hanging="360"/>
+      </w:pPr>
+      <w:rPr/>
+    </w:lvl>
+    <w:lvl w:ilvl="4">
+      <w:start w:val="1"/>
+      <w:numFmt w:val="decimal"/>
+      <w:lvlText w:val="%5."/>
+      <w:lvlJc w:val="left"/>
+      <w:pPr>
+        <w:tabs>
+          <w:tab w:val="num" w:pos="2160"/>
+        </w:tabs>
+        <w:ind w:left="2160" w:hanging="360"/>
+      </w:pPr>
+      <w:rPr/>
+    </w:lvl>
+    <w:lvl w:ilvl="5">
+      <w:start w:val="1"/>
+      <w:numFmt w:val="decimal"/>
+      <w:lvlText w:val="%6."/>
+      <w:lvlJc w:val="left"/>
+      <w:pPr>
+        <w:tabs>
+          <w:tab w:val="num" w:pos="2520"/>
+        </w:tabs>
+        <w:ind w:left="2520" w:hanging="360"/>
+      </w:pPr>
+      <w:rPr/>
+    </w:lvl>
+    <w:lvl w:ilvl="6">
+      <w:start w:val="1"/>
+      <w:numFmt w:val="decimal"/>
+      <w:lvlText w:val="%7."/>
+      <w:lvlJc w:val="left"/>
+      <w:pPr>
+        <w:tabs>
+          <w:tab w:val="num" w:pos="2880"/>
+        </w:tabs>
+        <w:ind w:left="2880" w:hanging="360"/>
+      </w:pPr>
+      <w:rPr/>
+    </w:lvl>
+    <w:lvl w:ilvl="7">
+      <w:start w:val="1"/>
+      <w:numFmt w:val="decimal"/>
+      <w:lvlText w:val="%8."/>
+      <w:lvlJc w:val="left"/>
+      <w:pPr>
+        <w:tabs>
+          <w:tab w:val="num" w:pos="3240"/>
+        </w:tabs>
+        <w:ind w:left="3240" w:hanging="360"/>
+      </w:pPr>
+      <w:rPr/>
+    </w:lvl>
+    <w:lvl w:ilvl="8">
+      <w:start w:val="1"/>
+      <w:numFmt w:val="decimal"/>
+      <w:lvlText w:val="%9."/>
+      <w:lvlJc w:val="left"/>
+      <w:pPr>
+        <w:tabs>
+          <w:tab w:val="num" w:pos="3600"/>
+        </w:tabs>
+        <w:ind w:left="3600" w:hanging="360"/>
+      </w:pPr>
+      <w:rPr/>
+    </w:lvl>
+  </w:abstractNum>
+  <w:abstractNum w:abstractNumId="5">
+    <w:lvl w:ilvl="0">
+      <w:start w:val="1"/>
+      <w:numFmt w:val="bullet"/>
+      <w:lvlText w:val=""/>
+      <w:lvlJc w:val="left"/>
+      <w:pPr>
+        <w:tabs>
+          <w:tab w:val="num" w:pos="0"/>
+        </w:tabs>
+        <w:ind w:left="403" w:hanging="201"/>
+      </w:pPr>
+      <w:rPr>
+        <w:rFonts w:ascii="Symbol" w:hAnsi="Symbol" w:cs="Symbol" w:hint="default"/>
+      </w:rPr>
+    </w:lvl>
+    <w:lvl w:ilvl="1">
+      <w:start w:val="1"/>
+      <w:numFmt w:val="decimal"/>
+      <w:lvlText w:val="%2."/>
+      <w:lvlJc w:val="left"/>
+      <w:pPr>
+        <w:tabs>
+          <w:tab w:val="num" w:pos="1080"/>
+        </w:tabs>
+        <w:ind w:left="1080" w:hanging="360"/>
+      </w:pPr>
+      <w:rPr/>
+    </w:lvl>
+    <w:lvl w:ilvl="2">
+      <w:start w:val="1"/>
+      <w:numFmt w:val="decimal"/>
+      <w:lvlText w:val="%3."/>
+      <w:lvlJc w:val="left"/>
+      <w:pPr>
+        <w:tabs>
+          <w:tab w:val="num" w:pos="1440"/>
+        </w:tabs>
+        <w:ind w:left="1440" w:hanging="360"/>
+      </w:pPr>
+      <w:rPr/>
+    </w:lvl>
+    <w:lvl w:ilvl="3">
+      <w:start w:val="1"/>
+      <w:numFmt w:val="decimal"/>
+      <w:lvlText w:val="%4."/>
+      <w:lvlJc w:val="left"/>
+      <w:pPr>
+        <w:tabs>
+          <w:tab w:val="num" w:pos="1800"/>
+        </w:tabs>
+        <w:ind w:left="1800" w:hanging="360"/>
+      </w:pPr>
+      <w:rPr/>
+    </w:lvl>
+    <w:lvl w:ilvl="4">
+      <w:start w:val="1"/>
+      <w:numFmt w:val="decimal"/>
+      <w:lvlText w:val="%5."/>
+      <w:lvlJc w:val="left"/>
+      <w:pPr>
+        <w:tabs>
+          <w:tab w:val="num" w:pos="2160"/>
+        </w:tabs>
+        <w:ind w:left="2160" w:hanging="360"/>
+      </w:pPr>
+      <w:rPr/>
+    </w:lvl>
+    <w:lvl w:ilvl="5">
+      <w:start w:val="1"/>
+      <w:numFmt w:val="decimal"/>
+      <w:lvlText w:val="%6."/>
+      <w:lvlJc w:val="left"/>
+      <w:pPr>
+        <w:tabs>
+          <w:tab w:val="num" w:pos="2520"/>
+        </w:tabs>
+        <w:ind w:left="2520" w:hanging="360"/>
+      </w:pPr>
+      <w:rPr/>
+    </w:lvl>
+    <w:lvl w:ilvl="6">
+      <w:start w:val="1"/>
+      <w:numFmt w:val="decimal"/>
+      <w:lvlText w:val="%7."/>
+      <w:lvlJc w:val="left"/>
+      <w:pPr>
+        <w:tabs>
+          <w:tab w:val="num" w:pos="2880"/>
+        </w:tabs>
+        <w:ind w:left="2880" w:hanging="360"/>
+      </w:pPr>
+      <w:rPr/>
+    </w:lvl>
+    <w:lvl w:ilvl="7">
+      <w:start w:val="1"/>
+      <w:numFmt w:val="decimal"/>
+      <w:lvlText w:val="%8."/>
+      <w:lvlJc w:val="left"/>
+      <w:pPr>
+        <w:tabs>
+          <w:tab w:val="num" w:pos="3240"/>
+        </w:tabs>
+        <w:ind w:left="3240" w:hanging="360"/>
+      </w:pPr>
+      <w:rPr/>
+    </w:lvl>
+    <w:lvl w:ilvl="8">
+      <w:start w:val="1"/>
+      <w:numFmt w:val="decimal"/>
+      <w:lvlText w:val="%9."/>
+      <w:lvlJc w:val="left"/>
+      <w:pPr>
+        <w:tabs>
+          <w:tab w:val="num" w:pos="3600"/>
+        </w:tabs>
+        <w:ind w:left="3600" w:hanging="360"/>
+      </w:pPr>
+      <w:rPr/>
+    </w:lvl>
+  </w:abstractNum>
+  <w:abstractNum w:abstractNumId="6">
+    <w:lvl w:ilvl="0">
+      <w:start w:val="1"/>
+      <w:numFmt w:val="bullet"/>
+      <w:lvlText w:val=""/>
+      <w:lvlJc w:val="left"/>
+      <w:pPr>
+        <w:tabs>
+          <w:tab w:val="num" w:pos="0"/>
+        </w:tabs>
+        <w:ind w:left="403" w:hanging="201"/>
+      </w:pPr>
+      <w:rPr>
+        <w:rFonts w:ascii="Symbol" w:hAnsi="Symbol" w:cs="Symbol" w:hint="default"/>
+      </w:rPr>
+    </w:lvl>
+    <w:lvl w:ilvl="1">
+      <w:start w:val="1"/>
+      <w:numFmt w:val="decimal"/>
+      <w:lvlText w:val="%2."/>
+      <w:lvlJc w:val="left"/>
+      <w:pPr>
+        <w:tabs>
+          <w:tab w:val="num" w:pos="1080"/>
+        </w:tabs>
+        <w:ind w:left="1080" w:hanging="360"/>
+      </w:pPr>
+      <w:rPr/>
+    </w:lvl>
+    <w:lvl w:ilvl="2">
+      <w:start w:val="1"/>
+      <w:numFmt w:val="decimal"/>
+      <w:lvlText w:val="%3."/>
+      <w:lvlJc w:val="left"/>
+      <w:pPr>
+        <w:tabs>
+          <w:tab w:val="num" w:pos="1440"/>
+        </w:tabs>
+        <w:ind w:left="1440" w:hanging="360"/>
+      </w:pPr>
+      <w:rPr/>
+    </w:lvl>
+    <w:lvl w:ilvl="3">
+      <w:start w:val="1"/>
+      <w:numFmt w:val="decimal"/>
+      <w:lvlText w:val="%4."/>
+      <w:lvlJc w:val="left"/>
+      <w:pPr>
+        <w:tabs>
+          <w:tab w:val="num" w:pos="1800"/>
+        </w:tabs>
+        <w:ind w:left="1800" w:hanging="360"/>
+      </w:pPr>
+      <w:rPr/>
+    </w:lvl>
+    <w:lvl w:ilvl="4">
+      <w:start w:val="1"/>
+      <w:numFmt w:val="decimal"/>
+      <w:lvlText w:val="%5."/>
+      <w:lvlJc w:val="left"/>
+      <w:pPr>
+        <w:tabs>
+          <w:tab w:val="num" w:pos="2160"/>
+        </w:tabs>
+        <w:ind w:left="2160" w:hanging="360"/>
+      </w:pPr>
+      <w:rPr/>
+    </w:lvl>
+    <w:lvl w:ilvl="5">
+      <w:start w:val="1"/>
+      <w:numFmt w:val="decimal"/>
+      <w:lvlText w:val="%6."/>
+      <w:lvlJc w:val="left"/>
+      <w:pPr>
+        <w:tabs>
+          <w:tab w:val="num" w:pos="2520"/>
+        </w:tabs>
+        <w:ind w:left="2520" w:hanging="360"/>
+      </w:pPr>
+      <w:rPr/>
+    </w:lvl>
+    <w:lvl w:ilvl="6">
+      <w:start w:val="1"/>
+      <w:numFmt w:val="decimal"/>
+      <w:lvlText w:val="%7."/>
+      <w:lvlJc w:val="left"/>
+      <w:pPr>
+        <w:tabs>
+          <w:tab w:val="num" w:pos="2880"/>
+        </w:tabs>
+        <w:ind w:left="2880" w:hanging="360"/>
+      </w:pPr>
+      <w:rPr/>
+    </w:lvl>
+    <w:lvl w:ilvl="7">
+      <w:start w:val="1"/>
+      <w:numFmt w:val="decimal"/>
+      <w:lvlText w:val="%8."/>
+      <w:lvlJc w:val="left"/>
+      <w:pPr>
+        <w:tabs>
+          <w:tab w:val="num" w:pos="3240"/>
+        </w:tabs>
+        <w:ind w:left="3240" w:hanging="360"/>
+      </w:pPr>
+      <w:rPr/>
+    </w:lvl>
+    <w:lvl w:ilvl="8">
+      <w:start w:val="1"/>
+      <w:numFmt w:val="decimal"/>
+      <w:lvlText w:val="%9."/>
+      <w:lvlJc w:val="left"/>
+      <w:pPr>
+        <w:tabs>
+          <w:tab w:val="num" w:pos="3600"/>
+        </w:tabs>
+        <w:ind w:left="3600" w:hanging="360"/>
+      </w:pPr>
+      <w:rPr/>
+    </w:lvl>
+  </w:abstractNum>
+  <w:abstractNum w:abstractNumId="7">
+    <w:lvl w:ilvl="0">
+      <w:start w:val="1"/>
+      <w:numFmt w:val="bullet"/>
+      <w:lvlText w:val=""/>
+      <w:lvlJc w:val="left"/>
+      <w:pPr>
+        <w:tabs>
+          <w:tab w:val="num" w:pos="0"/>
+        </w:tabs>
+        <w:ind w:left="403" w:hanging="201"/>
+      </w:pPr>
+      <w:rPr>
+        <w:rFonts w:ascii="Symbol" w:hAnsi="Symbol" w:cs="Symbol" w:hint="default"/>
+      </w:rPr>
+    </w:lvl>
+    <w:lvl w:ilvl="1">
+      <w:start w:val="1"/>
+      <w:numFmt w:val="decimal"/>
+      <w:lvlText w:val="%2."/>
+      <w:lvlJc w:val="left"/>
+      <w:pPr>
+        <w:tabs>
+          <w:tab w:val="num" w:pos="1080"/>
+        </w:tabs>
+        <w:ind w:left="1080" w:hanging="360"/>
+      </w:pPr>
+      <w:rPr/>
+    </w:lvl>
+    <w:lvl w:ilvl="2">
+      <w:start w:val="1"/>
+      <w:numFmt w:val="decimal"/>
+      <w:lvlText w:val="%3."/>
+      <w:lvlJc w:val="left"/>
+      <w:pPr>
+        <w:tabs>
+          <w:tab w:val="num" w:pos="1440"/>
+        </w:tabs>
+        <w:ind w:left="1440" w:hanging="360"/>
+      </w:pPr>
+      <w:rPr/>
+    </w:lvl>
+    <w:lvl w:ilvl="3">
+      <w:start w:val="1"/>
+      <w:numFmt w:val="decimal"/>
+      <w:lvlText w:val="%4."/>
+      <w:lvlJc w:val="left"/>
+      <w:pPr>
+        <w:tabs>
+          <w:tab w:val="num" w:pos="1800"/>
+        </w:tabs>
+        <w:ind w:left="1800" w:hanging="360"/>
+      </w:pPr>
+      <w:rPr/>
+    </w:lvl>
+    <w:lvl w:ilvl="4">
+      <w:start w:val="1"/>
+      <w:numFmt w:val="decimal"/>
+      <w:lvlText w:val="%5."/>
+      <w:lvlJc w:val="left"/>
+      <w:pPr>
+        <w:tabs>
+          <w:tab w:val="num" w:pos="2160"/>
+        </w:tabs>
+        <w:ind w:left="2160" w:hanging="360"/>
+      </w:pPr>
+      <w:rPr/>
+    </w:lvl>
+    <w:lvl w:ilvl="5">
+      <w:start w:val="1"/>
+      <w:numFmt w:val="decimal"/>
+      <w:lvlText w:val="%6."/>
+      <w:lvlJc w:val="left"/>
+      <w:pPr>
+        <w:tabs>
+          <w:tab w:val="num" w:pos="2520"/>
+        </w:tabs>
+        <w:ind w:left="2520" w:hanging="360"/>
+      </w:pPr>
+      <w:rPr/>
+    </w:lvl>
+    <w:lvl w:ilvl="6">
+      <w:start w:val="1"/>
+      <w:numFmt w:val="decimal"/>
+      <w:lvlText w:val="%7."/>
+      <w:lvlJc w:val="left"/>
+      <w:pPr>
+        <w:tabs>
+          <w:tab w:val="num" w:pos="2880"/>
+        </w:tabs>
+        <w:ind w:left="2880" w:hanging="360"/>
+      </w:pPr>
+      <w:rPr/>
+    </w:lvl>
+    <w:lvl w:ilvl="7">
+      <w:start w:val="1"/>
+      <w:numFmt w:val="decimal"/>
+      <w:lvlText w:val="%8."/>
+      <w:lvlJc w:val="left"/>
+      <w:pPr>
+        <w:tabs>
+          <w:tab w:val="num" w:pos="3240"/>
+        </w:tabs>
+        <w:ind w:left="3240" w:hanging="360"/>
+      </w:pPr>
+      <w:rPr/>
+    </w:lvl>
+    <w:lvl w:ilvl="8">
+      <w:start w:val="1"/>
+      <w:numFmt w:val="decimal"/>
+      <w:lvlText w:val="%9."/>
+      <w:lvlJc w:val="left"/>
+      <w:pPr>
+        <w:tabs>
+          <w:tab w:val="num" w:pos="3600"/>
+        </w:tabs>
+        <w:ind w:left="3600" w:hanging="360"/>
+      </w:pPr>
+      <w:rPr/>
+    </w:lvl>
+  </w:abstractNum>
+  <w:abstractNum w:abstractNumId="8">
+    <w:lvl w:ilvl="0">
+      <w:start w:val="1"/>
+      <w:numFmt w:val="bullet"/>
+      <w:lvlText w:val=""/>
+      <w:lvlJc w:val="left"/>
+      <w:pPr>
+        <w:tabs>
+          <w:tab w:val="num" w:pos="0"/>
+        </w:tabs>
+        <w:ind w:left="403" w:hanging="201"/>
+      </w:pPr>
+      <w:rPr>
+        <w:rFonts w:ascii="Symbol" w:hAnsi="Symbol" w:cs="Symbol" w:hint="default"/>
+      </w:rPr>
+    </w:lvl>
+    <w:lvl w:ilvl="1">
+      <w:start w:val="1"/>
+      <w:numFmt w:val="decimal"/>
+      <w:lvlText w:val="%2."/>
+      <w:lvlJc w:val="left"/>
+      <w:pPr>
+        <w:tabs>
+          <w:tab w:val="num" w:pos="1080"/>
+        </w:tabs>
+        <w:ind w:left="1080" w:hanging="360"/>
+      </w:pPr>
+      <w:rPr/>
+    </w:lvl>
+    <w:lvl w:ilvl="2">
+      <w:start w:val="1"/>
+      <w:numFmt w:val="decimal"/>
+      <w:lvlText w:val="%3."/>
+      <w:lvlJc w:val="left"/>
+      <w:pPr>
+        <w:tabs>
+          <w:tab w:val="num" w:pos="1440"/>
+        </w:tabs>
+        <w:ind w:left="1440" w:hanging="360"/>
+      </w:pPr>
+      <w:rPr/>
+    </w:lvl>
+    <w:lvl w:ilvl="3">
+      <w:start w:val="1"/>
+      <w:numFmt w:val="decimal"/>
+      <w:lvlText w:val="%4."/>
+      <w:lvlJc w:val="left"/>
+      <w:pPr>
+        <w:tabs>
+          <w:tab w:val="num" w:pos="1800"/>
+        </w:tabs>
+        <w:ind w:left="1800" w:hanging="360"/>
+      </w:pPr>
+      <w:rPr/>
+    </w:lvl>
+    <w:lvl w:ilvl="4">
+      <w:start w:val="1"/>
+      <w:numFmt w:val="decimal"/>
+      <w:lvlText w:val="%5."/>
+      <w:lvlJc w:val="left"/>
+      <w:pPr>
+        <w:tabs>
+          <w:tab w:val="num" w:pos="2160"/>
+        </w:tabs>
+        <w:ind w:left="2160" w:hanging="360"/>
+      </w:pPr>
+      <w:rPr/>
+    </w:lvl>
+    <w:lvl w:ilvl="5">
+      <w:start w:val="1"/>
+      <w:numFmt w:val="decimal"/>
+      <w:lvlText w:val="%6."/>
+      <w:lvlJc w:val="left"/>
+      <w:pPr>
+        <w:tabs>
+          <w:tab w:val="num" w:pos="2520"/>
+        </w:tabs>
+        <w:ind w:left="2520" w:hanging="360"/>
+      </w:pPr>
+      <w:rPr/>
+    </w:lvl>
+    <w:lvl w:ilvl="6">
+      <w:start w:val="1"/>
+      <w:numFmt w:val="decimal"/>
+      <w:lvlText w:val="%7."/>
+      <w:lvlJc w:val="left"/>
+      <w:pPr>
+        <w:tabs>
+          <w:tab w:val="num" w:pos="2880"/>
+        </w:tabs>
+        <w:ind w:left="2880" w:hanging="360"/>
+      </w:pPr>
+      <w:rPr/>
+    </w:lvl>
+    <w:lvl w:ilvl="7">
+      <w:start w:val="1"/>
+      <w:numFmt w:val="decimal"/>
+      <w:lvlText w:val="%8."/>
+      <w:lvlJc w:val="left"/>
+      <w:pPr>
+        <w:tabs>
+          <w:tab w:val="num" w:pos="3240"/>
+        </w:tabs>
+        <w:ind w:left="3240" w:hanging="360"/>
+      </w:pPr>
+      <w:rPr/>
+    </w:lvl>
+    <w:lvl w:ilvl="8">
+      <w:start w:val="1"/>
+      <w:numFmt w:val="decimal"/>
+      <w:lvlText w:val="%9."/>
+      <w:lvlJc w:val="left"/>
+      <w:pPr>
+        <w:tabs>
+          <w:tab w:val="num" w:pos="3600"/>
+        </w:tabs>
+        <w:ind w:left="3600" w:hanging="360"/>
+      </w:pPr>
+      <w:rPr/>
+    </w:lvl>
+  </w:abstractNum>
+  <w:abstractNum w:abstractNumId="9">
+    <w:lvl w:ilvl="0">
+      <w:start w:val="1"/>
+      <w:numFmt w:val="bullet"/>
+      <w:lvlText w:val=""/>
+      <w:lvlJc w:val="left"/>
+      <w:pPr>
+        <w:tabs>
+          <w:tab w:val="num" w:pos="0"/>
+        </w:tabs>
+        <w:ind w:left="403" w:hanging="201"/>
+      </w:pPr>
+      <w:rPr>
+        <w:rFonts w:ascii="Symbol" w:hAnsi="Symbol" w:cs="Symbol" w:hint="default"/>
+      </w:rPr>
+    </w:lvl>
+    <w:lvl w:ilvl="1">
+      <w:start w:val="1"/>
+      <w:numFmt w:val="decimal"/>
+      <w:lvlText w:val="%2."/>
+      <w:lvlJc w:val="left"/>
+      <w:pPr>
+        <w:tabs>
+          <w:tab w:val="num" w:pos="1080"/>
+        </w:tabs>
+        <w:ind w:left="1080" w:hanging="360"/>
+      </w:pPr>
+      <w:rPr/>
+    </w:lvl>
+    <w:lvl w:ilvl="2">
+      <w:start w:val="1"/>
+      <w:numFmt w:val="decimal"/>
+      <w:lvlText w:val="%3."/>
+      <w:lvlJc w:val="left"/>
+      <w:pPr>
+        <w:tabs>
+          <w:tab w:val="num" w:pos="1440"/>
+        </w:tabs>
+        <w:ind w:left="1440" w:hanging="360"/>
+      </w:pPr>
+      <w:rPr/>
+    </w:lvl>
+    <w:lvl w:ilvl="3">
+      <w:start w:val="1"/>
+      <w:numFmt w:val="decimal"/>
+      <w:lvlText w:val="%4."/>
+      <w:lvlJc w:val="left"/>
+      <w:pPr>
+        <w:tabs>
+          <w:tab w:val="num" w:pos="1800"/>
+        </w:tabs>
+        <w:ind w:left="1800" w:hanging="360"/>
+      </w:pPr>
+      <w:rPr/>
+    </w:lvl>
+    <w:lvl w:ilvl="4">
+      <w:start w:val="1"/>
+      <w:numFmt w:val="decimal"/>
+      <w:lvlText w:val="%5."/>
+      <w:lvlJc w:val="left"/>
+      <w:pPr>
+        <w:tabs>
+          <w:tab w:val="num" w:pos="2160"/>
+        </w:tabs>
+        <w:ind w:left="2160" w:hanging="360"/>
+      </w:pPr>
+      <w:rPr/>
+    </w:lvl>
+    <w:lvl w:ilvl="5">
+      <w:start w:val="1"/>
+      <w:numFmt w:val="decimal"/>
+      <w:lvlText w:val="%6."/>
+      <w:lvlJc w:val="left"/>
+      <w:pPr>
+        <w:tabs>
+          <w:tab w:val="num" w:pos="2520"/>
+        </w:tabs>
+        <w:ind w:left="2520" w:hanging="360"/>
+      </w:pPr>
+      <w:rPr/>
+    </w:lvl>
+    <w:lvl w:ilvl="6">
+      <w:start w:val="1"/>
+      <w:numFmt w:val="decimal"/>
+      <w:lvlText w:val="%7."/>
+      <w:lvlJc w:val="left"/>
+      <w:pPr>
+        <w:tabs>
+          <w:tab w:val="num" w:pos="2880"/>
+        </w:tabs>
+        <w:ind w:left="2880" w:hanging="360"/>
+      </w:pPr>
+      <w:rPr/>
+    </w:lvl>
+    <w:lvl w:ilvl="7">
+      <w:start w:val="1"/>
+      <w:numFmt w:val="decimal"/>
+      <w:lvlText w:val="%8."/>
+      <w:lvlJc w:val="left"/>
+      <w:pPr>
+        <w:tabs>
+          <w:tab w:val="num" w:pos="3240"/>
+        </w:tabs>
+        <w:ind w:left="3240" w:hanging="360"/>
+      </w:pPr>
+      <w:rPr/>
+    </w:lvl>
+    <w:lvl w:ilvl="8">
+      <w:start w:val="1"/>
+      <w:numFmt w:val="decimal"/>
+      <w:lvlText w:val="%9."/>
+      <w:lvlJc w:val="left"/>
+      <w:pPr>
+        <w:tabs>
+          <w:tab w:val="num" w:pos="3600"/>
+        </w:tabs>
+        <w:ind w:left="3600" w:hanging="360"/>
+      </w:pPr>
+      <w:rPr/>
+    </w:lvl>
+  </w:abstractNum>
+  <w:abstractNum w:abstractNumId="10">
+    <w:lvl w:ilvl="0">
+      <w:start w:val="1"/>
+      <w:numFmt w:val="bullet"/>
+      <w:lvlText w:val=""/>
+      <w:lvlJc w:val="left"/>
+      <w:pPr>
+        <w:tabs>
+          <w:tab w:val="num" w:pos="0"/>
+        </w:tabs>
+        <w:ind w:left="403" w:hanging="201"/>
+      </w:pPr>
+      <w:rPr>
+        <w:rFonts w:ascii="Symbol" w:hAnsi="Symbol" w:cs="Symbol" w:hint="default"/>
+      </w:rPr>
+    </w:lvl>
+    <w:lvl w:ilvl="1">
+      <w:start w:val="1"/>
+      <w:numFmt w:val="decimal"/>
+      <w:lvlText w:val="%2."/>
+      <w:lvlJc w:val="left"/>
+      <w:pPr>
+        <w:tabs>
+          <w:tab w:val="num" w:pos="1080"/>
+        </w:tabs>
+        <w:ind w:left="1080" w:hanging="360"/>
+      </w:pPr>
+      <w:rPr/>
+    </w:lvl>
+    <w:lvl w:ilvl="2">
+      <w:start w:val="1"/>
+      <w:numFmt w:val="decimal"/>
+      <w:lvlText w:val="%3."/>
+      <w:lvlJc w:val="left"/>
+      <w:pPr>
+        <w:tabs>
+          <w:tab w:val="num" w:pos="1440"/>
+        </w:tabs>
+        <w:ind w:left="1440" w:hanging="360"/>
+      </w:pPr>
+      <w:rPr/>
+    </w:lvl>
+    <w:lvl w:ilvl="3">
+      <w:start w:val="1"/>
+      <w:numFmt w:val="decimal"/>
+      <w:lvlText w:val="%4."/>
+      <w:lvlJc w:val="left"/>
+      <w:pPr>
+        <w:tabs>
+          <w:tab w:val="num" w:pos="1800"/>
+        </w:tabs>
+        <w:ind w:left="1800" w:hanging="360"/>
+      </w:pPr>
+      <w:rPr/>
+    </w:lvl>
+    <w:lvl w:ilvl="4">
+      <w:start w:val="1"/>
+      <w:numFmt w:val="decimal"/>
+      <w:lvlText w:val="%5."/>
+      <w:lvlJc w:val="left"/>
+      <w:pPr>
+        <w:tabs>
+          <w:tab w:val="num" w:pos="2160"/>
+        </w:tabs>
+        <w:ind w:left="2160" w:hanging="360"/>
+      </w:pPr>
+      <w:rPr/>
+    </w:lvl>
+    <w:lvl w:ilvl="5">
+      <w:start w:val="1"/>
+      <w:numFmt w:val="decimal"/>
+      <w:lvlText w:val="%6."/>
+      <w:lvlJc w:val="left"/>
+      <w:pPr>
+        <w:tabs>
+          <w:tab w:val="num" w:pos="2520"/>
+        </w:tabs>
+        <w:ind w:left="2520" w:hanging="360"/>
+      </w:pPr>
+      <w:rPr/>
+    </w:lvl>
+    <w:lvl w:ilvl="6">
+      <w:start w:val="1"/>
+      <w:numFmt w:val="decimal"/>
+      <w:lvlText w:val="%7."/>
+      <w:lvlJc w:val="left"/>
+      <w:pPr>
+        <w:tabs>
+          <w:tab w:val="num" w:pos="2880"/>
+        </w:tabs>
+        <w:ind w:left="2880" w:hanging="360"/>
+      </w:pPr>
+      <w:rPr/>
+    </w:lvl>
+    <w:lvl w:ilvl="7">
+      <w:start w:val="1"/>
+      <w:numFmt w:val="decimal"/>
+      <w:lvlText w:val="%8."/>
+      <w:lvlJc w:val="left"/>
+      <w:pPr>
+        <w:tabs>
+          <w:tab w:val="num" w:pos="3240"/>
+        </w:tabs>
+        <w:ind w:left="3240" w:hanging="360"/>
+      </w:pPr>
+      <w:rPr/>
+    </w:lvl>
+    <w:lvl w:ilvl="8">
+      <w:start w:val="1"/>
+      <w:numFmt w:val="decimal"/>
+      <w:lvlText w:val="%9."/>
+      <w:lvlJc w:val="left"/>
+      <w:pPr>
+        <w:tabs>
+          <w:tab w:val="num" w:pos="3600"/>
+        </w:tabs>
+        <w:ind w:left="3600" w:hanging="360"/>
+      </w:pPr>
+      <w:rPr/>
+    </w:lvl>
+  </w:abstractNum>
+  <w:abstractNum w:abstractNumId="11">
+    <w:lvl w:ilvl="0">
+      <w:start w:val="1"/>
+      <w:numFmt w:val="bullet"/>
+      <w:lvlText w:val=""/>
+      <w:lvlJc w:val="left"/>
+      <w:pPr>
+        <w:tabs>
+          <w:tab w:val="num" w:pos="0"/>
+        </w:tabs>
+        <w:ind w:left="403" w:hanging="201"/>
+      </w:pPr>
+      <w:rPr>
+        <w:rFonts w:ascii="Symbol" w:hAnsi="Symbol" w:cs="Symbol" w:hint="default"/>
+      </w:rPr>
+    </w:lvl>
+    <w:lvl w:ilvl="1">
+      <w:start w:val="1"/>
+      <w:numFmt w:val="decimal"/>
+      <w:lvlText w:val="%2."/>
+      <w:lvlJc w:val="left"/>
+      <w:pPr>
+        <w:tabs>
+          <w:tab w:val="num" w:pos="1080"/>
+        </w:tabs>
+        <w:ind w:left="1080" w:hanging="360"/>
+      </w:pPr>
+      <w:rPr/>
+    </w:lvl>
+    <w:lvl w:ilvl="2">
+      <w:start w:val="1"/>
+      <w:numFmt w:val="decimal"/>
+      <w:lvlText w:val="%3."/>
+      <w:lvlJc w:val="left"/>
+      <w:pPr>
+        <w:tabs>
+          <w:tab w:val="num" w:pos="1440"/>
+        </w:tabs>
+        <w:ind w:left="1440" w:hanging="360"/>
+      </w:pPr>
+      <w:rPr/>
+    </w:lvl>
+    <w:lvl w:ilvl="3">
+      <w:start w:val="1"/>
+      <w:numFmt w:val="decimal"/>
+      <w:lvlText w:val="%4."/>
+      <w:lvlJc w:val="left"/>
+      <w:pPr>
+        <w:tabs>
+          <w:tab w:val="num" w:pos="1800"/>
+        </w:tabs>
+        <w:ind w:left="1800" w:hanging="360"/>
+      </w:pPr>
+      <w:rPr/>
+    </w:lvl>
+    <w:lvl w:ilvl="4">
+      <w:start w:val="1"/>
+      <w:numFmt w:val="decimal"/>
+      <w:lvlText w:val="%5."/>
+      <w:lvlJc w:val="left"/>
+      <w:pPr>
+        <w:tabs>
+          <w:tab w:val="num" w:pos="2160"/>
+        </w:tabs>
+        <w:ind w:left="2160" w:hanging="360"/>
+      </w:pPr>
+      <w:rPr/>
+    </w:lvl>
+    <w:lvl w:ilvl="5">
+      <w:start w:val="1"/>
+      <w:numFmt w:val="decimal"/>
+      <w:lvlText w:val="%6."/>
+      <w:lvlJc w:val="left"/>
+      <w:pPr>
+        <w:tabs>
+          <w:tab w:val="num" w:pos="2520"/>
+        </w:tabs>
+        <w:ind w:left="2520" w:hanging="360"/>
+      </w:pPr>
+      <w:rPr/>
+    </w:lvl>
+    <w:lvl w:ilvl="6">
+      <w:start w:val="1"/>
+      <w:numFmt w:val="decimal"/>
+      <w:lvlText w:val="%7."/>
+      <w:lvlJc w:val="left"/>
+      <w:pPr>
+        <w:tabs>
+          <w:tab w:val="num" w:pos="2880"/>
+        </w:tabs>
+        <w:ind w:left="2880" w:hanging="360"/>
+      </w:pPr>
+      <w:rPr/>
+    </w:lvl>
+    <w:lvl w:ilvl="7">
+      <w:start w:val="1"/>
+      <w:numFmt w:val="decimal"/>
+      <w:lvlText w:val="%8."/>
+      <w:lvlJc w:val="left"/>
+      <w:pPr>
+        <w:tabs>
+          <w:tab w:val="num" w:pos="3240"/>
+        </w:tabs>
+        <w:ind w:left="3240" w:hanging="360"/>
+      </w:pPr>
+      <w:rPr/>
+    </w:lvl>
+    <w:lvl w:ilvl="8">
+      <w:start w:val="1"/>
+      <w:numFmt w:val="decimal"/>
+      <w:lvlText w:val="%9."/>
+      <w:lvlJc w:val="left"/>
+      <w:pPr>
+        <w:tabs>
+          <w:tab w:val="num" w:pos="3600"/>
+        </w:tabs>
+        <w:ind w:left="3600" w:hanging="360"/>
+      </w:pPr>
+      <w:rPr/>
+    </w:lvl>
+  </w:abstractNum>
+  <w:abstractNum w:abstractNumId="12">
+    <w:lvl w:ilvl="0">
+      <w:start w:val="1"/>
+      <w:numFmt w:val="bullet"/>
+      <w:lvlText w:val=""/>
+      <w:lvlJc w:val="left"/>
+      <w:pPr>
+        <w:tabs>
+          <w:tab w:val="num" w:pos="0"/>
+        </w:tabs>
+        <w:ind w:left="403" w:hanging="201"/>
+      </w:pPr>
+      <w:rPr>
+        <w:rFonts w:ascii="Symbol" w:hAnsi="Symbol" w:cs="Symbol" w:hint="default"/>
+      </w:rPr>
+    </w:lvl>
+    <w:lvl w:ilvl="1">
+      <w:start w:val="1"/>
+      <w:numFmt w:val="decimal"/>
+      <w:lvlText w:val="%2."/>
+      <w:lvlJc w:val="left"/>
+      <w:pPr>
+        <w:tabs>
+          <w:tab w:val="num" w:pos="1080"/>
+        </w:tabs>
+        <w:ind w:left="1080" w:hanging="360"/>
+      </w:pPr>
+      <w:rPr/>
+    </w:lvl>
+    <w:lvl w:ilvl="2">
+      <w:start w:val="1"/>
+      <w:numFmt w:val="decimal"/>
+      <w:lvlText w:val="%3."/>
+      <w:lvlJc w:val="left"/>
+      <w:pPr>
+        <w:tabs>
+          <w:tab w:val="num" w:pos="1440"/>
+        </w:tabs>
+        <w:ind w:left="1440" w:hanging="360"/>
+      </w:pPr>
+      <w:rPr/>
+    </w:lvl>
+    <w:lvl w:ilvl="3">
+      <w:start w:val="1"/>
+      <w:numFmt w:val="decimal"/>
+      <w:lvlText w:val="%4."/>
+      <w:lvlJc w:val="left"/>
+      <w:pPr>
+        <w:tabs>
+          <w:tab w:val="num" w:pos="1800"/>
+        </w:tabs>
+        <w:ind w:left="1800" w:hanging="360"/>
+      </w:pPr>
+      <w:rPr/>
+    </w:lvl>
+    <w:lvl w:ilvl="4">
+      <w:start w:val="1"/>
+      <w:numFmt w:val="decimal"/>
+      <w:lvlText w:val="%5."/>
+      <w:lvlJc w:val="left"/>
+      <w:pPr>
+        <w:tabs>
+          <w:tab w:val="num" w:pos="2160"/>
+        </w:tabs>
+        <w:ind w:left="2160" w:hanging="360"/>
+      </w:pPr>
+      <w:rPr/>
+    </w:lvl>
+    <w:lvl w:ilvl="5">
+      <w:start w:val="1"/>
+      <w:numFmt w:val="decimal"/>
+      <w:lvlText w:val="%6."/>
+      <w:lvlJc w:val="left"/>
+      <w:pPr>
+        <w:tabs>
+          <w:tab w:val="num" w:pos="2520"/>
+        </w:tabs>
+        <w:ind w:left="2520" w:hanging="360"/>
+      </w:pPr>
+      <w:rPr/>
+    </w:lvl>
+    <w:lvl w:ilvl="6">
+      <w:start w:val="1"/>
+      <w:numFmt w:val="decimal"/>
+      <w:lvlText w:val="%7."/>
+      <w:lvlJc w:val="left"/>
+      <w:pPr>
+        <w:tabs>
+          <w:tab w:val="num" w:pos="2880"/>
+        </w:tabs>
+        <w:ind w:left="2880" w:hanging="360"/>
+      </w:pPr>
+      <w:rPr/>
+    </w:lvl>
+    <w:lvl w:ilvl="7">
+      <w:start w:val="1"/>
+      <w:numFmt w:val="decimal"/>
+      <w:lvlText w:val="%8."/>
+      <w:lvlJc w:val="left"/>
+      <w:pPr>
+        <w:tabs>
+          <w:tab w:val="num" w:pos="3240"/>
+        </w:tabs>
+        <w:ind w:left="3240" w:hanging="360"/>
+      </w:pPr>
+      <w:rPr/>
+    </w:lvl>
+    <w:lvl w:ilvl="8">
+      <w:start w:val="1"/>
+      <w:numFmt w:val="decimal"/>
+      <w:lvlText w:val="%9."/>
+      <w:lvlJc w:val="left"/>
+      <w:pPr>
+        <w:tabs>
+          <w:tab w:val="num" w:pos="3600"/>
+        </w:tabs>
+        <w:ind w:left="3600" w:hanging="360"/>
+      </w:pPr>
+      <w:rPr/>
+    </w:lvl>
+  </w:abstractNum>
+  <w:abstractNum w:abstractNumId="13">
+    <w:lvl w:ilvl="0">
+      <w:start w:val="1"/>
+      <w:numFmt w:val="bullet"/>
+      <w:lvlText w:val=""/>
+      <w:lvlJc w:val="left"/>
+      <w:pPr>
+        <w:tabs>
+          <w:tab w:val="num" w:pos="0"/>
+        </w:tabs>
+        <w:ind w:left="403" w:hanging="201"/>
+      </w:pPr>
+      <w:rPr>
+        <w:rFonts w:ascii="Symbol" w:hAnsi="Symbol" w:cs="Symbol" w:hint="default"/>
+      </w:rPr>
+    </w:lvl>
+    <w:lvl w:ilvl="1">
+      <w:start w:val="1"/>
+      <w:numFmt w:val="decimal"/>
+      <w:lvlText w:val="%2."/>
+      <w:lvlJc w:val="left"/>
+      <w:pPr>
+        <w:tabs>
+          <w:tab w:val="num" w:pos="1080"/>
+        </w:tabs>
+        <w:ind w:left="1080" w:hanging="360"/>
+      </w:pPr>
+      <w:rPr/>
+    </w:lvl>
+    <w:lvl w:ilvl="2">
+      <w:start w:val="1"/>
+      <w:numFmt w:val="decimal"/>
+      <w:lvlText w:val="%3."/>
+      <w:lvlJc w:val="left"/>
+      <w:pPr>
+        <w:tabs>
+          <w:tab w:val="num" w:pos="1440"/>
+        </w:tabs>
+        <w:ind w:left="1440" w:hanging="360"/>
+      </w:pPr>
+      <w:rPr/>
+    </w:lvl>
+    <w:lvl w:ilvl="3">
+      <w:start w:val="1"/>
+      <w:numFmt w:val="decimal"/>
+      <w:lvlText w:val="%4."/>
+      <w:lvlJc w:val="left"/>
+      <w:pPr>
+        <w:tabs>
+          <w:tab w:val="num" w:pos="1800"/>
+        </w:tabs>
+        <w:ind w:left="1800" w:hanging="360"/>
+      </w:pPr>
+      <w:rPr/>
+    </w:lvl>
+    <w:lvl w:ilvl="4">
+      <w:start w:val="1"/>
+      <w:numFmt w:val="decimal"/>
+      <w:lvlText w:val="%5."/>
+      <w:lvlJc w:val="left"/>
+      <w:pPr>
+        <w:tabs>
+          <w:tab w:val="num" w:pos="2160"/>
+        </w:tabs>
+        <w:ind w:left="2160" w:hanging="360"/>
+      </w:pPr>
+      <w:rPr/>
+    </w:lvl>
+    <w:lvl w:ilvl="5">
+      <w:start w:val="1"/>
+      <w:numFmt w:val="decimal"/>
+      <w:lvlText w:val="%6."/>
+      <w:lvlJc w:val="left"/>
+      <w:pPr>
+        <w:tabs>
+          <w:tab w:val="num" w:pos="2520"/>
+        </w:tabs>
+        <w:ind w:left="2520" w:hanging="360"/>
+      </w:pPr>
+      <w:rPr/>
+    </w:lvl>
+    <w:lvl w:ilvl="6">
+      <w:start w:val="1"/>
+      <w:numFmt w:val="decimal"/>
+      <w:lvlText w:val="%7."/>
+      <w:lvlJc w:val="left"/>
+      <w:pPr>
+        <w:tabs>
+          <w:tab w:val="num" w:pos="2880"/>
+        </w:tabs>
+        <w:ind w:left="2880" w:hanging="360"/>
+      </w:pPr>
+      <w:rPr/>
+    </w:lvl>
+    <w:lvl w:ilvl="7">
+      <w:start w:val="1"/>
+      <w:numFmt w:val="decimal"/>
+      <w:lvlText w:val="%8."/>
+      <w:lvlJc w:val="left"/>
+      <w:pPr>
+        <w:tabs>
+          <w:tab w:val="num" w:pos="3240"/>
+        </w:tabs>
+        <w:ind w:left="3240" w:hanging="360"/>
+      </w:pPr>
+      <w:rPr/>
+    </w:lvl>
+    <w:lvl w:ilvl="8">
+      <w:start w:val="1"/>
+      <w:numFmt w:val="decimal"/>
+      <w:lvlText w:val="%9."/>
+      <w:lvlJc w:val="left"/>
+      <w:pPr>
+        <w:tabs>
+          <w:tab w:val="num" w:pos="3600"/>
+        </w:tabs>
+        <w:ind w:left="3600" w:hanging="360"/>
+      </w:pPr>
+      <w:rPr/>
+    </w:lvl>
+  </w:abstractNum>
+  <w:abstractNum w:abstractNumId="14">
+    <w:lvl w:ilvl="0">
+      <w:start w:val="1"/>
+      <w:numFmt w:val="bullet"/>
+      <w:lvlText w:val=""/>
+      <w:lvlJc w:val="left"/>
+      <w:pPr>
+        <w:tabs>
+          <w:tab w:val="num" w:pos="0"/>
+        </w:tabs>
+        <w:ind w:left="403" w:hanging="201"/>
+      </w:pPr>
+      <w:rPr>
+        <w:rFonts w:ascii="Symbol" w:hAnsi="Symbol" w:cs="Symbol" w:hint="default"/>
+      </w:rPr>
+    </w:lvl>
+    <w:lvl w:ilvl="1">
+      <w:start w:val="1"/>
+      <w:numFmt w:val="decimal"/>
+      <w:lvlText w:val="%2."/>
+      <w:lvlJc w:val="left"/>
+      <w:pPr>
+        <w:tabs>
+          <w:tab w:val="num" w:pos="1080"/>
+        </w:tabs>
+        <w:ind w:left="1080" w:hanging="360"/>
+      </w:pPr>
+      <w:rPr/>
+    </w:lvl>
+    <w:lvl w:ilvl="2">
+      <w:start w:val="1"/>
+      <w:numFmt w:val="decimal"/>
+      <w:lvlText w:val="%3."/>
+      <w:lvlJc w:val="left"/>
+      <w:pPr>
+        <w:tabs>
+          <w:tab w:val="num" w:pos="1440"/>
+        </w:tabs>
+        <w:ind w:left="1440" w:hanging="360"/>
+      </w:pPr>
+      <w:rPr/>
+    </w:lvl>
+    <w:lvl w:ilvl="3">
+      <w:start w:val="1"/>
+      <w:numFmt w:val="decimal"/>
+      <w:lvlText w:val="%4."/>
+      <w:lvlJc w:val="left"/>
+      <w:pPr>
+        <w:tabs>
+          <w:tab w:val="num" w:pos="1800"/>
+        </w:tabs>
+        <w:ind w:left="1800" w:hanging="360"/>
+      </w:pPr>
+      <w:rPr/>
+    </w:lvl>
+    <w:lvl w:ilvl="4">
+      <w:start w:val="1"/>
+      <w:numFmt w:val="decimal"/>
+      <w:lvlText w:val="%5."/>
+      <w:lvlJc w:val="left"/>
+      <w:pPr>
+        <w:tabs>
+          <w:tab w:val="num" w:pos="2160"/>
+        </w:tabs>
+        <w:ind w:left="2160" w:hanging="360"/>
+      </w:pPr>
+      <w:rPr/>
+    </w:lvl>
+    <w:lvl w:ilvl="5">
+      <w:start w:val="1"/>
+      <w:numFmt w:val="decimal"/>
+      <w:lvlText w:val="%6."/>
+      <w:lvlJc w:val="left"/>
+      <w:pPr>
+        <w:tabs>
+          <w:tab w:val="num" w:pos="2520"/>
+        </w:tabs>
+        <w:ind w:left="2520" w:hanging="360"/>
+      </w:pPr>
+      <w:rPr/>
+    </w:lvl>
+    <w:lvl w:ilvl="6">
+      <w:start w:val="1"/>
+      <w:numFmt w:val="decimal"/>
+      <w:lvlText w:val="%7."/>
+      <w:lvlJc w:val="left"/>
+      <w:pPr>
+        <w:tabs>
+          <w:tab w:val="num" w:pos="2880"/>
+        </w:tabs>
+        <w:ind w:left="2880" w:hanging="360"/>
+      </w:pPr>
+      <w:rPr/>
+    </w:lvl>
+    <w:lvl w:ilvl="7">
+      <w:start w:val="1"/>
+      <w:numFmt w:val="decimal"/>
+      <w:lvlText w:val="%8."/>
+      <w:lvlJc w:val="left"/>
+      <w:pPr>
+        <w:tabs>
+          <w:tab w:val="num" w:pos="3240"/>
+        </w:tabs>
+        <w:ind w:left="3240" w:hanging="360"/>
+      </w:pPr>
+      <w:rPr/>
+    </w:lvl>
+    <w:lvl w:ilvl="8">
+      <w:start w:val="1"/>
+      <w:numFmt w:val="decimal"/>
+      <w:lvlText w:val="%9."/>
+      <w:lvlJc w:val="left"/>
+      <w:pPr>
+        <w:tabs>
+          <w:tab w:val="num" w:pos="3600"/>
+        </w:tabs>
+        <w:ind w:left="3600" w:hanging="360"/>
+      </w:pPr>
+      <w:rPr/>
+    </w:lvl>
+  </w:abstractNum>
+  <w:abstractNum w:abstractNumId="15">
+    <w:lvl w:ilvl="0">
+      <w:start w:val="1"/>
+      <w:numFmt w:val="bullet"/>
+      <w:lvlText w:val=""/>
+      <w:lvlJc w:val="left"/>
+      <w:pPr>
+        <w:tabs>
+          <w:tab w:val="num" w:pos="0"/>
+        </w:tabs>
+        <w:ind w:left="403" w:hanging="201"/>
+      </w:pPr>
+      <w:rPr>
+        <w:rFonts w:ascii="Symbol" w:hAnsi="Symbol" w:cs="Symbol" w:hint="default"/>
+      </w:rPr>
+    </w:lvl>
+    <w:lvl w:ilvl="1">
+      <w:start w:val="1"/>
+      <w:numFmt w:val="decimal"/>
+      <w:lvlText w:val="%2."/>
+      <w:lvlJc w:val="left"/>
+      <w:pPr>
+        <w:tabs>
+          <w:tab w:val="num" w:pos="1080"/>
+        </w:tabs>
+        <w:ind w:left="1080" w:hanging="360"/>
+      </w:pPr>
+      <w:rPr/>
+    </w:lvl>
+    <w:lvl w:ilvl="2">
+      <w:start w:val="1"/>
+      <w:numFmt w:val="decimal"/>
+      <w:lvlText w:val="%3."/>
+      <w:lvlJc w:val="left"/>
+      <w:pPr>
+        <w:tabs>
+          <w:tab w:val="num" w:pos="1440"/>
+        </w:tabs>
+        <w:ind w:left="1440" w:hanging="360"/>
+      </w:pPr>
+      <w:rPr/>
+    </w:lvl>
+    <w:lvl w:ilvl="3">
+      <w:start w:val="1"/>
+      <w:numFmt w:val="decimal"/>
+      <w:lvlText w:val="%4."/>
+      <w:lvlJc w:val="left"/>
+      <w:pPr>
+        <w:tabs>
+          <w:tab w:val="num" w:pos="1800"/>
+        </w:tabs>
+        <w:ind w:left="1800" w:hanging="360"/>
+      </w:pPr>
+      <w:rPr/>
+    </w:lvl>
+    <w:lvl w:ilvl="4">
+      <w:start w:val="1"/>
+      <w:numFmt w:val="decimal"/>
+      <w:lvlText w:val="%5."/>
+      <w:lvlJc w:val="left"/>
+      <w:pPr>
+        <w:tabs>
+          <w:tab w:val="num" w:pos="2160"/>
+        </w:tabs>
+        <w:ind w:left="2160" w:hanging="360"/>
+      </w:pPr>
+      <w:rPr/>
+    </w:lvl>
+    <w:lvl w:ilvl="5">
+      <w:start w:val="1"/>
+      <w:numFmt w:val="decimal"/>
+      <w:lvlText w:val="%6."/>
+      <w:lvlJc w:val="left"/>
+      <w:pPr>
+        <w:tabs>
+          <w:tab w:val="num" w:pos="2520"/>
+        </w:tabs>
+        <w:ind w:left="2520" w:hanging="360"/>
+      </w:pPr>
+      <w:rPr/>
+    </w:lvl>
+    <w:lvl w:ilvl="6">
+      <w:start w:val="1"/>
+      <w:numFmt w:val="decimal"/>
+      <w:lvlText w:val="%7."/>
+      <w:lvlJc w:val="left"/>
+      <w:pPr>
+        <w:tabs>
+          <w:tab w:val="num" w:pos="2880"/>
+        </w:tabs>
+        <w:ind w:left="2880" w:hanging="360"/>
+      </w:pPr>
+      <w:rPr/>
+    </w:lvl>
+    <w:lvl w:ilvl="7">
+      <w:start w:val="1"/>
+      <w:numFmt w:val="decimal"/>
+      <w:lvlText w:val="%8."/>
+      <w:lvlJc w:val="left"/>
+      <w:pPr>
+        <w:tabs>
+          <w:tab w:val="num" w:pos="3240"/>
+        </w:tabs>
+        <w:ind w:left="3240" w:hanging="360"/>
+      </w:pPr>
+      <w:rPr/>
+    </w:lvl>
+    <w:lvl w:ilvl="8">
+      <w:start w:val="1"/>
+      <w:numFmt w:val="decimal"/>
+      <w:lvlText w:val="%9."/>
+      <w:lvlJc w:val="left"/>
+      <w:pPr>
+        <w:tabs>
+          <w:tab w:val="num" w:pos="3600"/>
+        </w:tabs>
+        <w:ind w:left="3600" w:hanging="360"/>
+      </w:pPr>
+      <w:rPr/>
+    </w:lvl>
+  </w:abstractNum>
+  <w:abstractNum w:abstractNumId="16">
+    <w:lvl w:ilvl="0">
+      <w:start w:val="1"/>
+      <w:numFmt w:val="bullet"/>
+      <w:lvlText w:val=""/>
+      <w:lvlJc w:val="left"/>
+      <w:pPr>
+        <w:tabs>
+          <w:tab w:val="num" w:pos="0"/>
+        </w:tabs>
+        <w:ind w:left="403" w:hanging="201"/>
+      </w:pPr>
+      <w:rPr>
+        <w:rFonts w:ascii="Symbol" w:hAnsi="Symbol" w:cs="Symbol" w:hint="default"/>
+      </w:rPr>
+    </w:lvl>
+    <w:lvl w:ilvl="1">
+      <w:start w:val="1"/>
+      <w:numFmt w:val="decimal"/>
+      <w:lvlText w:val="%2."/>
+      <w:lvlJc w:val="left"/>
+      <w:pPr>
+        <w:tabs>
+          <w:tab w:val="num" w:pos="1080"/>
+        </w:tabs>
+        <w:ind w:left="1080" w:hanging="360"/>
+      </w:pPr>
+      <w:rPr/>
+    </w:lvl>
+    <w:lvl w:ilvl="2">
+      <w:start w:val="1"/>
+      <w:numFmt w:val="decimal"/>
+      <w:lvlText w:val="%3."/>
+      <w:lvlJc w:val="left"/>
+      <w:pPr>
+        <w:tabs>
+          <w:tab w:val="num" w:pos="1440"/>
+        </w:tabs>
+        <w:ind w:left="1440" w:hanging="360"/>
+      </w:pPr>
+      <w:rPr/>
+    </w:lvl>
+    <w:lvl w:ilvl="3">
+      <w:start w:val="1"/>
+      <w:numFmt w:val="decimal"/>
+      <w:lvlText w:val="%4."/>
+      <w:lvlJc w:val="left"/>
+      <w:pPr>
+        <w:tabs>
+          <w:tab w:val="num" w:pos="1800"/>
+        </w:tabs>
+        <w:ind w:left="1800" w:hanging="360"/>
+      </w:pPr>
+      <w:rPr/>
+    </w:lvl>
+    <w:lvl w:ilvl="4">
+      <w:start w:val="1"/>
+      <w:numFmt w:val="decimal"/>
+      <w:lvlText w:val="%5."/>
+      <w:lvlJc w:val="left"/>
+      <w:pPr>
+        <w:tabs>
+          <w:tab w:val="num" w:pos="2160"/>
+        </w:tabs>
+        <w:ind w:left="2160" w:hanging="360"/>
+      </w:pPr>
+      <w:rPr/>
+    </w:lvl>
+    <w:lvl w:ilvl="5">
+      <w:start w:val="1"/>
+      <w:numFmt w:val="decimal"/>
+      <w:lvlText w:val="%6."/>
+      <w:lvlJc w:val="left"/>
+      <w:pPr>
+        <w:tabs>
+          <w:tab w:val="num" w:pos="2520"/>
+        </w:tabs>
+        <w:ind w:left="2520" w:hanging="360"/>
+      </w:pPr>
+      <w:rPr/>
+    </w:lvl>
+    <w:lvl w:ilvl="6">
+      <w:start w:val="1"/>
+      <w:numFmt w:val="decimal"/>
+      <w:lvlText w:val="%7."/>
+      <w:lvlJc w:val="left"/>
+      <w:pPr>
+        <w:tabs>
+          <w:tab w:val="num" w:pos="2880"/>
+        </w:tabs>
+        <w:ind w:left="2880" w:hanging="360"/>
+      </w:pPr>
+      <w:rPr/>
+    </w:lvl>
+    <w:lvl w:ilvl="7">
+      <w:start w:val="1"/>
+      <w:numFmt w:val="decimal"/>
+      <w:lvlText w:val="%8."/>
+      <w:lvlJc w:val="left"/>
+      <w:pPr>
+        <w:tabs>
+          <w:tab w:val="num" w:pos="3240"/>
+        </w:tabs>
+        <w:ind w:left="3240" w:hanging="360"/>
+      </w:pPr>
+      <w:rPr/>
+    </w:lvl>
+    <w:lvl w:ilvl="8">
+      <w:start w:val="1"/>
+      <w:numFmt w:val="decimal"/>
+      <w:lvlText w:val="%9."/>
+      <w:lvlJc w:val="left"/>
+      <w:pPr>
+        <w:tabs>
+          <w:tab w:val="num" w:pos="3600"/>
+        </w:tabs>
+        <w:ind w:left="3600" w:hanging="360"/>
+      </w:pPr>
+      <w:rPr/>
+    </w:lvl>
+  </w:abstractNum>
+  <w:abstractNum w:abstractNumId="17">
+    <w:lvl w:ilvl="0">
+      <w:start w:val="1"/>
+      <w:numFmt w:val="bullet"/>
+      <w:lvlText w:val=""/>
+      <w:lvlJc w:val="left"/>
+      <w:pPr>
+        <w:tabs>
+          <w:tab w:val="num" w:pos="0"/>
+        </w:tabs>
+        <w:ind w:left="403" w:hanging="201"/>
+      </w:pPr>
+      <w:rPr>
+        <w:rFonts w:ascii="Symbol" w:hAnsi="Symbol" w:cs="Symbol" w:hint="default"/>
+      </w:rPr>
+    </w:lvl>
+    <w:lvl w:ilvl="1">
+      <w:start w:val="1"/>
+      <w:numFmt w:val="decimal"/>
+      <w:lvlText w:val="%2."/>
+      <w:lvlJc w:val="left"/>
+      <w:pPr>
+        <w:tabs>
+          <w:tab w:val="num" w:pos="1080"/>
+        </w:tabs>
+        <w:ind w:left="1080" w:hanging="360"/>
+      </w:pPr>
+      <w:rPr/>
+    </w:lvl>
+    <w:lvl w:ilvl="2">
+      <w:start w:val="1"/>
+      <w:numFmt w:val="decimal"/>
+      <w:lvlText w:val="%3."/>
+      <w:lvlJc w:val="left"/>
+      <w:pPr>
+        <w:tabs>
+          <w:tab w:val="num" w:pos="1440"/>
+        </w:tabs>
+        <w:ind w:left="1440" w:hanging="360"/>
+      </w:pPr>
+      <w:rPr/>
+    </w:lvl>
+    <w:lvl w:ilvl="3">
+      <w:start w:val="1"/>
+      <w:numFmt w:val="decimal"/>
+      <w:lvlText w:val="%4."/>
+      <w:lvlJc w:val="left"/>
+      <w:pPr>
+        <w:tabs>
+          <w:tab w:val="num" w:pos="1800"/>
+        </w:tabs>
+        <w:ind w:left="1800" w:hanging="360"/>
+      </w:pPr>
+      <w:rPr/>
+    </w:lvl>
+    <w:lvl w:ilvl="4">
+      <w:start w:val="1"/>
+      <w:numFmt w:val="decimal"/>
+      <w:lvlText w:val="%5."/>
+      <w:lvlJc w:val="left"/>
+      <w:pPr>
+        <w:tabs>
+          <w:tab w:val="num" w:pos="2160"/>
+        </w:tabs>
+        <w:ind w:left="2160" w:hanging="360"/>
+      </w:pPr>
+      <w:rPr/>
+    </w:lvl>
+    <w:lvl w:ilvl="5">
+      <w:start w:val="1"/>
+      <w:numFmt w:val="decimal"/>
+      <w:lvlText w:val="%6."/>
+      <w:lvlJc w:val="left"/>
+      <w:pPr>
+        <w:tabs>
+          <w:tab w:val="num" w:pos="2520"/>
+        </w:tabs>
+        <w:ind w:left="2520" w:hanging="360"/>
+      </w:pPr>
+      <w:rPr/>
+    </w:lvl>
+    <w:lvl w:ilvl="6">
+      <w:start w:val="1"/>
+      <w:numFmt w:val="decimal"/>
+      <w:lvlText w:val="%7."/>
+      <w:lvlJc w:val="left"/>
+      <w:pPr>
+        <w:tabs>
+          <w:tab w:val="num" w:pos="2880"/>
+        </w:tabs>
+        <w:ind w:left="2880" w:hanging="360"/>
+      </w:pPr>
+      <w:rPr/>
+    </w:lvl>
+    <w:lvl w:ilvl="7">
+      <w:start w:val="1"/>
+      <w:numFmt w:val="decimal"/>
+      <w:lvlText w:val="%8."/>
+      <w:lvlJc w:val="left"/>
+      <w:pPr>
+        <w:tabs>
+          <w:tab w:val="num" w:pos="3240"/>
+        </w:tabs>
+        <w:ind w:left="3240" w:hanging="360"/>
+      </w:pPr>
+      <w:rPr/>
+    </w:lvl>
+    <w:lvl w:ilvl="8">
+      <w:start w:val="1"/>
+      <w:numFmt w:val="decimal"/>
+      <w:lvlText w:val="%9."/>
+      <w:lvlJc w:val="left"/>
+      <w:pPr>
+        <w:tabs>
+          <w:tab w:val="num" w:pos="3600"/>
+        </w:tabs>
+        <w:ind w:left="3600" w:hanging="360"/>
+      </w:pPr>
+      <w:rPr/>
+    </w:lvl>
+  </w:abstractNum>
+  <w:abstractNum w:abstractNumId="18">
+    <w:lvl w:ilvl="0">
+      <w:start w:val="1"/>
       <w:numFmt w:val="none"/>
       <w:suff w:val="nothing"/>
       <w:lvlText w:val=""/>
@@ -1422,58 +3257,103 @@
     <w:abstractNumId w:val="3"/>
   </w:num>
   <w:num w:numId="4">
-    <w:abstractNumId w:val="2"/>
+    <w:abstractNumId w:val="4"/>
+  </w:num>
+  <w:num w:numId="5">
+    <w:abstractNumId w:val="5"/>
+  </w:num>
+  <w:num w:numId="6">
+    <w:abstractNumId w:val="6"/>
+  </w:num>
+  <w:num w:numId="7">
+    <w:abstractNumId w:val="7"/>
+  </w:num>
+  <w:num w:numId="8">
+    <w:abstractNumId w:val="8"/>
+  </w:num>
+  <w:num w:numId="9">
+    <w:abstractNumId w:val="9"/>
+  </w:num>
+  <w:num w:numId="10">
+    <w:abstractNumId w:val="10"/>
+  </w:num>
+  <w:num w:numId="11">
+    <w:abstractNumId w:val="11"/>
+  </w:num>
+  <w:num w:numId="12">
+    <w:abstractNumId w:val="12"/>
+  </w:num>
+  <w:num w:numId="13">
+    <w:abstractNumId w:val="13"/>
+  </w:num>
+  <w:num w:numId="14">
+    <w:abstractNumId w:val="14"/>
+  </w:num>
+  <w:num w:numId="15">
+    <w:abstractNumId w:val="15"/>
+  </w:num>
+  <w:num w:numId="16">
+    <w:abstractNumId w:val="16"/>
+  </w:num>
+  <w:num w:numId="17">
+    <w:abstractNumId w:val="17"/>
+  </w:num>
+  <w:num w:numId="18">
+    <w:abstractNumId w:val="18"/>
+  </w:num>
+  <w:num w:numId="19">
+    <w:abstractNumId w:val="1"/>
     <w:lvlOverride w:ilvl="0">
       <w:startOverride w:val="1"/>
     </w:lvlOverride>
   </w:num>
-  <w:num w:numId="5">
-    <w:abstractNumId w:val="2"/>
+  <w:num w:numId="20">
+    <w:abstractNumId w:val="1"/>
   </w:num>
-  <w:num w:numId="6">
-    <w:abstractNumId w:val="2"/>
+  <w:num w:numId="21">
+    <w:abstractNumId w:val="1"/>
   </w:num>
-  <w:num w:numId="7">
-    <w:abstractNumId w:val="2"/>
+  <w:num w:numId="22">
+    <w:abstractNumId w:val="1"/>
   </w:num>
-  <w:num w:numId="8">
-    <w:abstractNumId w:val="2"/>
+  <w:num w:numId="23">
+    <w:abstractNumId w:val="1"/>
   </w:num>
-  <w:num w:numId="9">
-    <w:abstractNumId w:val="2"/>
+  <w:num w:numId="24">
+    <w:abstractNumId w:val="1"/>
   </w:num>
-  <w:num w:numId="10">
-    <w:abstractNumId w:val="2"/>
+  <w:num w:numId="25">
+    <w:abstractNumId w:val="1"/>
   </w:num>
-  <w:num w:numId="11">
-    <w:abstractNumId w:val="2"/>
+  <w:num w:numId="26">
+    <w:abstractNumId w:val="1"/>
   </w:num>
-  <w:num w:numId="12">
-    <w:abstractNumId w:val="2"/>
+  <w:num w:numId="27">
+    <w:abstractNumId w:val="1"/>
   </w:num>
-  <w:num w:numId="13">
-    <w:abstractNumId w:val="2"/>
+  <w:num w:numId="28">
+    <w:abstractNumId w:val="1"/>
   </w:num>
-  <w:num w:numId="14">
-    <w:abstractNumId w:val="2"/>
+  <w:num w:numId="29">
+    <w:abstractNumId w:val="1"/>
   </w:num>
-  <w:num w:numId="15">
-    <w:abstractNumId w:val="2"/>
+  <w:num w:numId="30">
+    <w:abstractNumId w:val="1"/>
   </w:num>
-  <w:num w:numId="16">
-    <w:abstractNumId w:val="2"/>
+  <w:num w:numId="31">
+    <w:abstractNumId w:val="1"/>
   </w:num>
-  <w:num w:numId="17">
-    <w:abstractNumId w:val="2"/>
+  <w:num w:numId="32">
+    <w:abstractNumId w:val="1"/>
   </w:num>
-  <w:num w:numId="18">
-    <w:abstractNumId w:val="2"/>
+  <w:num w:numId="33">
+    <w:abstractNumId w:val="1"/>
   </w:num>
-  <w:num w:numId="19">
-    <w:abstractNumId w:val="2"/>
+  <w:num w:numId="34">
+    <w:abstractNumId w:val="1"/>
   </w:num>
-  <w:num w:numId="20">
-    <w:abstractNumId w:val="2"/>
+  <w:num w:numId="35">
+    <w:abstractNumId w:val="1"/>
   </w:num>
 </w:numbering>
 </file>
@@ -1514,7 +3394,7 @@
   </w:style>
   <w:style w:type="paragraph" w:styleId="Heading1">
     <w:name w:val="heading 1"/>
-    <w:basedOn w:val="Ttulouser"/>
+    <w:basedOn w:val="Ttulo"/>
     <w:qFormat/>
     <w:pPr/>
     <w:rPr>
@@ -1525,7 +3405,7 @@
   </w:style>
   <w:style w:type="paragraph" w:styleId="Heading2">
     <w:name w:val="heading 2"/>
-    <w:basedOn w:val="Ttulouser"/>
+    <w:basedOn w:val="Ttulo"/>
     <w:qFormat/>
     <w:pPr/>
     <w:rPr>
@@ -1536,7 +3416,7 @@
   </w:style>
   <w:style w:type="paragraph" w:styleId="Heading3">
     <w:name w:val="heading 3"/>
-    <w:basedOn w:val="Ttulouser"/>
+    <w:basedOn w:val="Ttulo"/>
     <w:qFormat/>
     <w:pPr/>
     <w:rPr>
@@ -1547,7 +3427,7 @@
   </w:style>
   <w:style w:type="paragraph" w:styleId="Heading4">
     <w:name w:val="heading 4"/>
-    <w:basedOn w:val="Ttulouser"/>
+    <w:basedOn w:val="Ttulo"/>
     <w:qFormat/>
     <w:pPr/>
     <w:rPr>
@@ -1558,7 +3438,7 @@
   </w:style>
   <w:style w:type="paragraph" w:styleId="Heading5">
     <w:name w:val="heading 5"/>
-    <w:basedOn w:val="Ttulouser"/>
+    <w:basedOn w:val="Ttulo"/>
     <w:qFormat/>
     <w:pPr/>
     <w:rPr>
@@ -1567,7 +3447,7 @@
   </w:style>
   <w:style w:type="paragraph" w:styleId="Heading6">
     <w:name w:val="heading 6"/>
-    <w:basedOn w:val="Ttulouser"/>
+    <w:basedOn w:val="Ttulo"/>
     <w:qFormat/>
     <w:pPr/>
     <w:rPr>
@@ -1583,8 +3463,8 @@
       <w:u w:val="single"/>
     </w:rPr>
   </w:style>
-  <w:style w:type="character" w:styleId="Caracteresdenotaalpieuser">
-    <w:name w:val="Caracteres de nota al pie (user)"/>
+  <w:style w:type="character" w:styleId="Caracteresdenotaalpie">
+    <w:name w:val="Caracteres de nota al pie"/>
     <w:uiPriority w:val="99"/>
     <w:semiHidden/>
     <w:unhideWhenUsed/>
@@ -1593,8 +3473,8 @@
       <w:vertAlign w:val="superscript"/>
     </w:rPr>
   </w:style>
-  <w:style w:type="character" w:styleId="Caracteresdenotaalpie">
-    <w:name w:val="Caracteres de nota al pie"/>
+  <w:style w:type="character" w:styleId="Caracteresdenotaalpieuser">
+    <w:name w:val="Caracteres de nota al pie (user)"/>
     <w:qFormat/>
     <w:rPr>
       <w:vertAlign w:val="superscript"/>
@@ -1617,8 +3497,8 @@
       <w:szCs w:val="20"/>
     </w:rPr>
   </w:style>
-  <w:style w:type="character" w:styleId="Caracteresdenotafinaluser">
-    <w:name w:val="Caracteres de nota final (user)"/>
+  <w:style w:type="character" w:styleId="Caracteresdenotafinal">
+    <w:name w:val="Caracteres de nota final"/>
     <w:uiPriority w:val="99"/>
     <w:semiHidden/>
     <w:unhideWhenUsed/>
@@ -1627,8 +3507,8 @@
       <w:vertAlign w:val="superscript"/>
     </w:rPr>
   </w:style>
-  <w:style w:type="character" w:styleId="Caracteresdenotafinal">
-    <w:name w:val="Caracteres de nota final"/>
+  <w:style w:type="character" w:styleId="Caracteresdenotafinaluser">
+    <w:name w:val="Caracteres de nota final (user)"/>
     <w:qFormat/>
     <w:rPr>
       <w:vertAlign w:val="superscript"/>
@@ -1737,7 +3617,7 @@
   </w:style>
   <w:style w:type="paragraph" w:styleId="Title">
     <w:name w:val="Title"/>
-    <w:basedOn w:val="Ttulouser"/>
+    <w:basedOn w:val="Ttulo"/>
     <w:qFormat/>
     <w:pPr/>
     <w:rPr>

</xml_diff>